<commit_message>
docs: finalize Phase 0 remediation DOCX report
</commit_message>
<xml_diff>
--- a/docs/LAPORAN_REMEDIASI_PHASE0_SAKUKILAT.docx
+++ b/docs/LAPORAN_REMEDIASI_PHASE0_SAKUKILAT.docx
@@ -4,64 +4,90 @@
   <w:body>
     <w:p>
       <w:pPr>
-        <w:jc w:val="center"/>
+        <w:pStyle w:val="Title"/>
       </w:pPr>
+      <w:r>
+        <w:t>SAKUKILAT REMEDIATION PHASE 0 — LAPORAN RESMI</w:t>
+      </w:r>
+    </w:p>
+    <w:p>
       <w:r>
         <w:rPr>
           <w:b/>
-          <w:color w:val="0F172A"/>
-          <w:sz w:val="32"/>
         </w:rPr>
-        <w:t>SAKUKILAT — LAPORAN TEKNIS REMEDIASI PHASE 0</w:t>
+        <w:t>Tanggal: 10 September 2026</w:t>
         <w:br/>
-        <w:t>KOREKSI DAN PENYELESAIAN DEFISIENSI KRITIS</w:t>
+      </w:r>
+      <w:r>
+        <w:t>Baseline: main @ 7707ab86</w:t>
+        <w:br/>
+      </w:r>
+      <w:r>
+        <w:t>Current Local HEAD: 20d340a (13 commits ahead of origin/main)</w:t>
+        <w:br/>
+      </w:r>
+      <w:r>
+        <w:t>Status: LOCAL REMEDIATION COMPLETE — REMOTE HEAD &amp; HISTORY PURGE PENDING OWNER APPROVAL</w:t>
+        <w:br/>
       </w:r>
     </w:p>
     <w:p>
       <w:pPr>
-        <w:jc w:val="center"/>
+        <w:pStyle w:val="Heading1"/>
       </w:pPr>
       <w:r>
-        <w:rPr>
-          <w:i/>
-          <w:color w:val="475569"/>
-          <w:sz w:val="22"/>
-        </w:rPr>
-        <w:t>Audit, TDD Red-Green Regression, dan Penutupan Celah SK-001, SK-003, SK-004</w:t>
-        <w:br/>
+        <w:t>1. Ringkasan Status dan Temuan</w:t>
       </w:r>
     </w:p>
     <w:tbl>
       <w:tblPr>
         <w:tblW w:type="auto" w:w="0"/>
-        <w:jc w:val="center"/>
         <w:tblLook w:firstColumn="1" w:firstRow="1" w:lastColumn="0" w:lastRow="0" w:noHBand="0" w:noVBand="1" w:val="04A0"/>
       </w:tblPr>
       <w:tblGrid>
-        <w:gridCol w:w="4680"/>
-        <w:gridCol w:w="4680"/>
+        <w:gridCol w:w="2160"/>
+        <w:gridCol w:w="2160"/>
+        <w:gridCol w:w="2160"/>
+        <w:gridCol w:w="2160"/>
       </w:tblGrid>
       <w:tr>
         <w:tc>
           <w:tcPr>
-            <w:tcW w:type="dxa" w:w="3168"/>
+            <w:tcW w:type="dxa" w:w="2160"/>
           </w:tcPr>
           <w:p>
             <w:r>
-              <w:rPr>
-                <w:b/>
-              </w:rPr>
-              <w:t>Tanggal Laporan</w:t>
+              <w:t>Finding</w:t>
             </w:r>
           </w:p>
         </w:tc>
         <w:tc>
           <w:tcPr>
-            <w:tcW w:type="dxa" w:w="6192"/>
+            <w:tcW w:type="dxa" w:w="2160"/>
           </w:tcPr>
           <w:p>
             <w:r>
-              <w:t>10 September 2026</w:t>
+              <w:t>Severity</w:t>
+            </w:r>
+          </w:p>
+        </w:tc>
+        <w:tc>
+          <w:tcPr>
+            <w:tcW w:type="dxa" w:w="2160"/>
+          </w:tcPr>
+          <w:p>
+            <w:r>
+              <w:t>Status Lokal</w:t>
+            </w:r>
+          </w:p>
+        </w:tc>
+        <w:tc>
+          <w:tcPr>
+            <w:tcW w:type="dxa" w:w="2160"/>
+          </w:tcPr>
+          <w:p>
+            <w:r>
+              <w:t>Status Remote / Git</w:t>
             </w:r>
           </w:p>
         </w:tc>
@@ -69,24 +95,41 @@
       <w:tr>
         <w:tc>
           <w:tcPr>
-            <w:tcW w:type="dxa" w:w="3168"/>
+            <w:tcW w:type="dxa" w:w="2160"/>
           </w:tcPr>
           <w:p>
             <w:r>
-              <w:rPr>
-                <w:b/>
-              </w:rPr>
-              <w:t>Repository</w:t>
+              <w:t>SK-001 (Data Leak)</w:t>
             </w:r>
           </w:p>
         </w:tc>
         <w:tc>
           <w:tcPr>
-            <w:tcW w:type="dxa" w:w="6192"/>
+            <w:tcW w:type="dxa" w:w="2160"/>
           </w:tcPr>
           <w:p>
             <w:r>
-              <w:t>C:\Users\HYPE AMD\Projects\SakuKilat</w:t>
+              <w:t>P0</w:t>
+            </w:r>
+          </w:p>
+        </w:tc>
+        <w:tc>
+          <w:tcPr>
+            <w:tcW w:type="dxa" w:w="2160"/>
+          </w:tcPr>
+          <w:p>
+            <w:r>
+              <w:t>CONTAINED (File dihapus, .gitignore aktif, scanner terhubung)</w:t>
+            </w:r>
+          </w:p>
+        </w:tc>
+        <w:tc>
+          <w:tcPr>
+            <w:tcW w:type="dxa" w:w="2160"/>
+          </w:tcPr>
+          <w:p>
+            <w:r>
+              <w:t>EXPOSED (Ada di remote HEAD &amp; git history)</w:t>
             </w:r>
           </w:p>
         </w:tc>
@@ -94,28 +137,41 @@
       <w:tr>
         <w:tc>
           <w:tcPr>
-            <w:tcW w:type="dxa" w:w="3168"/>
+            <w:tcW w:type="dxa" w:w="2160"/>
           </w:tcPr>
           <w:p>
             <w:r>
-              <w:rPr>
-                <w:b/>
-              </w:rPr>
-              <w:t>Status Fase 0</w:t>
+              <w:t>SK-003 (Storage Corruption)</w:t>
             </w:r>
           </w:p>
         </w:tc>
         <w:tc>
           <w:tcPr>
-            <w:tcW w:type="dxa" w:w="6192"/>
+            <w:tcW w:type="dxa" w:w="2160"/>
           </w:tcPr>
           <w:p>
             <w:r>
-              <w:rPr>
-                <w:b/>
-                <w:color w:val="0D9488"/>
-              </w:rPr>
-              <w:t>LOCAL REMEDIATION COMPLETE — PENDING OWNER APPROVAL</w:t>
+              <w:t>P0</w:t>
+            </w:r>
+          </w:p>
+        </w:tc>
+        <w:tc>
+          <w:tcPr>
+            <w:tcW w:type="dxa" w:w="2160"/>
+          </w:tcPr>
+          <w:p>
+            <w:r>
+              <w:t>RESOLVED (18/18 PASS, block mutations, Recovery UI)</w:t>
+            </w:r>
+          </w:p>
+        </w:tc>
+        <w:tc>
+          <w:tcPr>
+            <w:tcW w:type="dxa" w:w="2160"/>
+          </w:tcPr>
+          <w:p>
+            <w:r>
+              <w:t>Lokal saja (Menunggu push)</w:t>
             </w:r>
           </w:p>
         </w:tc>
@@ -123,398 +179,41 @@
       <w:tr>
         <w:tc>
           <w:tcPr>
-            <w:tcW w:type="dxa" w:w="3168"/>
+            <w:tcW w:type="dxa" w:w="2160"/>
           </w:tcPr>
           <w:p>
             <w:r>
-              <w:rPr>
-                <w:b/>
-              </w:rPr>
-              <w:t>Current Local HEAD</w:t>
+              <w:t>SK-004 (Restore Integrity)</w:t>
             </w:r>
           </w:p>
         </w:tc>
         <w:tc>
           <w:tcPr>
-            <w:tcW w:type="dxa" w:w="6192"/>
+            <w:tcW w:type="dxa" w:w="2160"/>
           </w:tcPr>
           <w:p>
             <w:r>
-              <w:t>main @ e2b0308db91dd343e641693b8817b850449a0a03 (11 commit ahead)</w:t>
-            </w:r>
-          </w:p>
-        </w:tc>
-      </w:tr>
-      <w:tr>
-        <w:tc>
-          <w:tcPr>
-            <w:tcW w:type="dxa" w:w="3168"/>
-          </w:tcPr>
-          <w:p>
-            <w:r>
-              <w:rPr>
-                <w:b/>
-              </w:rPr>
-              <w:t>Baseline Remote</w:t>
+              <w:t>P0</w:t>
             </w:r>
           </w:p>
         </w:tc>
         <w:tc>
           <w:tcPr>
-            <w:tcW w:type="dxa" w:w="6192"/>
+            <w:tcW w:type="dxa" w:w="2160"/>
           </w:tcPr>
           <w:p>
             <w:r>
-              <w:t>origin/main @ 7707ab86adde25c47149a7d80ff1eca76c177673</w:t>
-            </w:r>
-          </w:p>
-        </w:tc>
-      </w:tr>
-    </w:tbl>
-    <w:p/>
-    <w:p>
-      <w:pPr>
-        <w:pStyle w:val="Heading1"/>
-      </w:pPr>
-      <w:r>
-        <w:t>1. Ringkasan Eksekutif &amp; Koreksi Status</w:t>
-      </w:r>
-    </w:p>
-    <w:p>
-      <w:r>
-        <w:t>Laporan ini menyajikan hasil koreksi dan penyelesaian menyeluruh terhadap klaim awal 'Phase 0 selesai'. Sebelumnya, repository berada pada kondisi 'Partially Remediated' dengan sejumlah kelemahan krusial: pengujian regresi masih menggunakan fungsi simulasi di dalam test alih-alih menguji kode produksi murni, kegagalan penanganan storage corrupt masih menimbulkan kehilangan data diam-diam (silent data loss), dan proses restore backup belum transaksional terhadap multi-key (mengabaikan target/goals).</w:t>
-        <w:br/>
-        <w:br/>
-        <w:t>Melalui 11 commit terisolasi dan siklus Test-Driven Development (TDD) Red-Green, seluruh akar masalah tersebut telah diselesaikan di level kode produksi lokal tanpa mengubah UI layout, font, format IDR, maupun applicationId.</w:t>
-      </w:r>
-    </w:p>
-    <w:p>
-      <w:pPr>
-        <w:pStyle w:val="Heading1"/>
-      </w:pPr>
-      <w:r>
-        <w:t>2. Temuan Awal yang Berhasil Direproduksi</w:t>
-      </w:r>
-    </w:p>
-    <w:p>
-      <w:pPr>
-        <w:pStyle w:val="ListBullet"/>
-      </w:pPr>
-      <w:r>
-        <w:rPr>
-          <w:b/>
-        </w:rPr>
-        <w:t xml:space="preserve">SK-001 (Paparan Data Finansial Personal): </w:t>
-      </w:r>
-      <w:r>
-        <w:t>Asset android/app/src/personal/assets/public/preloaded-state.json (424KB, 1.437 transaksi nyata) masih ada di HEAD remote origin/main dan di commit 97e04aa riwayat Git publik. File telah dibuang di local HEAD namun remote belum disinkronkan.</w:t>
-      </w:r>
-    </w:p>
-    <w:p>
-      <w:pPr>
-        <w:pStyle w:val="ListBullet"/>
-      </w:pPr>
-      <w:r>
-        <w:rPr>
-          <w:b/>
-        </w:rPr>
-        <w:t xml:space="preserve">SK-003 (Kehilangan Data Pasca-Corrupt &amp; Test Tiruan): </w:t>
-      </w:r>
-      <w:r>
-        <w:t>loadPersistedState lama menerima JSON array dan field corrupt sebagai state valid. Saat corrupt, aplikasi tetap membuka state kosong dan menerima transaksi baru tanpa error. User mendapat notifikasi sukses palsu, namun saat reload data hilang karena persistState menolak write secara silent.</w:t>
-      </w:r>
-    </w:p>
-    <w:p>
-      <w:pPr>
-        <w:pStyle w:val="ListBullet"/>
-      </w:pPr>
-      <w:r>
-        <w:rPr>
-          <w:b/>
-        </w:rPr>
-        <w:t xml:space="preserve">SK-004 (Restore Non-Transaksional &amp; Backup Cacat): </w:t>
-      </w:r>
-      <w:r>
-        <w:t>Checkpoint impor hanya menyimpan primary state dan mengabaikan goals. Jika penulisan goals gagal, state transaksi tetap tertimpa (partial restore). File backup dengan baris korup membuang baris korup diam-diam lalu menimpa seluruh ledger aktif tanpa pratinjau atau konfirmasi pengguna.</w:t>
-      </w:r>
-    </w:p>
-    <w:p>
-      <w:pPr>
-        <w:pStyle w:val="Heading1"/>
-      </w:pPr>
-      <w:r>
-        <w:t>3. Perbaikan Definitif yang Diterapkan</w:t>
-      </w:r>
-    </w:p>
-    <w:p>
-      <w:pPr>
-        <w:pStyle w:val="Heading2"/>
-      </w:pPr>
-      <w:r>
-        <w:t>A. Perbaikan SK-003: Penyimpanan &amp; Mode Pemulihan Terbuka</w:t>
-      </w:r>
-    </w:p>
-    <w:p>
-      <w:r>
-        <w:t>• Ekstraksi Helper Produksi (lib/storage.ts): Pusat kendali storage tunggal untuk loadPersistedState, persistState, canMutateState, dan quarantineCorrupt.</w:t>
-        <w:br/>
-        <w:t>• Validasi Struktur Ketat: Menolak JSON array, nilai primitif, dan field bertipe salah (transactions bukan array, wallets bukan array, dll).</w:t>
-        <w:br/>
-        <w:t>• Pemblokiran Mutasi Menyeluruh: Seluruh aksi mutasi di StoreProvider (addTransaction, addManualTransaction, editTransaction, deleteTransaction, createMove, addWallet, updateWallet, removeWallet, setMonthlyBudget, updateProfile) memeriksa canMutateState. Mutasi ditolak saat corrupt/incompatible tanpa toast sukses palsu.</w:t>
-        <w:br/>
-        <w:t>• Layar Pemulihan Darurat (components/storage-recovery-screen.tsx): Aplikasi mengunci antarmuka normal dan menampilkan kartu pemulihan dengan fitur Salin Data Mentah, Unduh Cadangan (.json), dan Mulai Ulang (Reset) hanya via konfirmasi pengguna.</w:t>
-        <w:br/>
-        <w:t>• Proteksi Kuota Penuh: Jika penyimpanan penuh saat membuat karantina, primary corrupt payload asli di STORAGE_KEY tetap aman dan tidak pernah ditimpa default kosong.</w:t>
-      </w:r>
-    </w:p>
-    <w:p>
-      <w:pPr>
-        <w:pStyle w:val="Heading2"/>
-      </w:pPr>
-      <w:r>
-        <w:t>B. Perbaikan SK-004: Restore Transaksional, Checkpoint Multi-Key &amp; Rollback</w:t>
-      </w:r>
-    </w:p>
-    <w:p>
-      <w:r>
-        <w:t>• Helper Perencanaan Produksi (lib/data-restore.ts): Fungsi planImport memvalidasi setiap baris transaksi (ID unik, nominal positif, tipe valid, tanggal valid). Jika ada satu baris cacat, seluruh impor ditolak (tidak ada silent record dropping).</w:t>
-        <w:br/>
-        <w:t>• Checkpoint Multi-Key: createMultiKeyCheckpoint menyimpan STORAGE_KEY dan GOAL_STORAGE_KEY secara bersamaan sebelum penulisan dilakukan.</w:t>
-        <w:br/>
-        <w:t>• Transaksi Atomik: executeImportTransaction menulis primary state dan goals sebagai satu transaksi logis. Jika penulisan goals gagal, primary state otomatis di-rollback ke checkpoint semula.</w:t>
-        <w:br/>
-        <w:t>• Pratinjau &amp; Konfirmasi UI (components/data-portability.tsx): Modal pratinjau menampilkan jumlah transaksi aktif vs baru, rentang tanggal, mode replace, dan status goals. Menolak impor replace tanpa konfirmasi eksplisit pengguna.</w:t>
-        <w:br/>
-        <w:t>• Rollback Produksi Nyata: executeRollback dan tombol 'Batalkan Impor Terakhir (Rollback)' tersedia langsung di UI untuk memulihkan seluruh data dari checkpoint kapan saja.</w:t>
-      </w:r>
-    </w:p>
-    <w:p>
-      <w:pPr>
-        <w:pStyle w:val="Heading2"/>
-      </w:pPr>
-      <w:r>
-        <w:t>C. Perbaikan SK-001: Integrasi Scanner &amp; Batasan Scope</w:t>
-      </w:r>
-    </w:p>
-    <w:p>
-      <w:r>
-        <w:t>• Integrasi Runner Terpadu: scripts/scan-personal-data.mjs diintegrasikan ke pnpm test via scripts/run-all-tests.mjs.</w:t>
-        <w:br/>
-        <w:t>• Batasan Scanner: Didokumentasikan secara jujur bahwa scanner ini adalah working-tree &amp; tracked-files hygiene check, bukan scanner riwayat Git, dan bukan detektor PII universal.</w:t>
-        <w:br/>
-        <w:t>• Pelaporan Terpisah: Memisahkan 41 functional regression tests dari 3 security checks.</w:t>
-      </w:r>
-    </w:p>
-    <w:p>
-      <w:pPr>
-        <w:pStyle w:val="Heading1"/>
-      </w:pPr>
-      <w:r>
-        <w:t>4. Bukti Siklus Red-Green Regression Test</w:t>
-      </w:r>
-    </w:p>
-    <w:tbl>
-      <w:tblPr>
-        <w:tblW w:type="auto" w:w="0"/>
-        <w:jc w:val="center"/>
-        <w:tblLook w:firstColumn="1" w:firstRow="1" w:lastColumn="0" w:lastRow="0" w:noHBand="0" w:noVBand="1" w:val="04A0"/>
-      </w:tblPr>
-      <w:tblGrid>
-        <w:gridCol w:w="3120"/>
-        <w:gridCol w:w="3120"/>
-        <w:gridCol w:w="3120"/>
-      </w:tblGrid>
-      <w:tr>
-        <w:tc>
-          <w:tcPr>
-            <w:tcW w:type="dxa" w:w="3120"/>
-          </w:tcPr>
-          <w:p>
-            <w:r>
-              <w:rPr>
-                <w:b/>
-              </w:rPr>
-              <w:t>Modul Pengujian</w:t>
+              <w:t>RESOLVED (16/16 PASS, multi-key checkpoint, rollback UI)</w:t>
             </w:r>
           </w:p>
         </w:tc>
         <w:tc>
           <w:tcPr>
-            <w:tcW w:type="dxa" w:w="3120"/>
+            <w:tcW w:type="dxa" w:w="2160"/>
           </w:tcPr>
           <w:p>
             <w:r>
-              <w:rPr>
-                <w:b/>
-              </w:rPr>
-              <w:t>Tahap RED (Sebelum Fix)</w:t>
-            </w:r>
-          </w:p>
-        </w:tc>
-        <w:tc>
-          <w:tcPr>
-            <w:tcW w:type="dxa" w:w="3120"/>
-          </w:tcPr>
-          <w:p>
-            <w:r>
-              <w:rPr>
-                <w:b/>
-              </w:rPr>
-              <w:t>Tahap GREEN (Setelah Fix)</w:t>
-            </w:r>
-          </w:p>
-        </w:tc>
-      </w:tr>
-      <w:tr>
-        <w:tc>
-          <w:tcPr>
-            <w:tcW w:type="dxa" w:w="3120"/>
-          </w:tcPr>
-          <w:p/>
-        </w:tc>
-        <w:tc>
-          <w:tcPr>
-            <w:tcW w:type="dxa" w:w="3120"/>
-          </w:tcPr>
-          <w:p/>
-        </w:tc>
-        <w:tc>
-          <w:tcPr>
-            <w:tcW w:type="dxa" w:w="3120"/>
-          </w:tcPr>
-          <w:p/>
-        </w:tc>
-      </w:tr>
-      <w:tr>
-        <w:tc>
-          <w:tcPr>
-            <w:tcW w:type="dxa" w:w="3120"/>
-          </w:tcPr>
-          <w:p/>
-        </w:tc>
-        <w:tc>
-          <w:tcPr>
-            <w:tcW w:type="dxa" w:w="3120"/>
-          </w:tcPr>
-          <w:p/>
-        </w:tc>
-        <w:tc>
-          <w:tcPr>
-            <w:tcW w:type="dxa" w:w="3120"/>
-          </w:tcPr>
-          <w:p/>
-        </w:tc>
-      </w:tr>
-      <w:tr>
-        <w:tc>
-          <w:tcPr>
-            <w:tcW w:type="dxa" w:w="3120"/>
-          </w:tcPr>
-          <w:p>
-            <w:r>
-              <w:rPr>
-                <w:b/>
-              </w:rPr>
-              <w:t>SK-003 Storage Corruption</w:t>
-              <w:br/>
-              <w:t>(lib/storage.ts)</w:t>
-            </w:r>
-          </w:p>
-        </w:tc>
-        <w:tc>
-          <w:tcPr>
-            <w:tcW w:type="dxa" w:w="3120"/>
-          </w:tcPr>
-          <w:p>
-            <w:r>
-              <w:rPr>
-                <w:color w:val="DC2626"/>
-              </w:rPr>
-              <w:t>4 GAGAL (Commit 4a4b6cd):</w:t>
-              <w:br/>
-              <w:t>- JSON array lolos valid</w:t>
-              <w:br/>
-              <w:t>- Field type salah lolos valid</w:t>
-              <w:br/>
-              <w:t>- Mutasi tidak diblokir saat corrupt</w:t>
-              <w:br/>
-              <w:t>- Mutasi tidak diblokir saat incompatible</w:t>
-            </w:r>
-          </w:p>
-        </w:tc>
-        <w:tc>
-          <w:tcPr>
-            <w:tcW w:type="dxa" w:w="3120"/>
-          </w:tcPr>
-          <w:p>
-            <w:r>
-              <w:rPr>
-                <w:color w:val="16A34A"/>
-              </w:rPr>
-              <w:t>18/18 PASS (Commit 74d3bbd):</w:t>
-              <w:br/>
-              <w:t>Semua skenario corrupt, incompatible, blocking, quarantine, dan reload lolos.</w:t>
-            </w:r>
-          </w:p>
-        </w:tc>
-      </w:tr>
-      <w:tr>
-        <w:tc>
-          <w:tcPr>
-            <w:tcW w:type="dxa" w:w="3120"/>
-          </w:tcPr>
-          <w:p>
-            <w:r>
-              <w:rPr>
-                <w:b/>
-              </w:rPr>
-              <w:t>SK-004 Transactional Restore</w:t>
-              <w:br/>
-              <w:t>(lib/data-restore.ts)</w:t>
-            </w:r>
-          </w:p>
-        </w:tc>
-        <w:tc>
-          <w:tcPr>
-            <w:tcW w:type="dxa" w:w="3120"/>
-          </w:tcPr>
-          <w:p>
-            <w:r>
-              <w:rPr>
-                <w:color w:val="DC2626"/>
-              </w:rPr>
-              <w:t>8 GAGAL (Commit 1fb7cf9):</w:t>
-              <w:br/>
-              <w:t>- Future schema lolos</w:t>
-              <w:br/>
-              <w:t>- Baris cacat dibuang diam-diam</w:t>
-              <w:br/>
-              <w:t>- Field invalid lolos</w:t>
-              <w:br/>
-              <w:t>- ID duplikat lolos</w:t>
-              <w:br/>
-              <w:t>- Checkpoint abaikan goals</w:t>
-              <w:br/>
-              <w:t>- Gagal goals tidak rollback primary</w:t>
-              <w:br/>
-              <w:t>- Rollback parsial</w:t>
-              <w:br/>
-              <w:t>- Replace tanpa konfirmasi</w:t>
-            </w:r>
-          </w:p>
-        </w:tc>
-        <w:tc>
-          <w:tcPr>
-            <w:tcW w:type="dxa" w:w="3120"/>
-          </w:tcPr>
-          <w:p>
-            <w:r>
-              <w:rPr>
-                <w:color w:val="16A34A"/>
-              </w:rPr>
-              <w:t>16/16 PASS (Commit 1e2a0b3):</w:t>
-              <w:br/>
-              <w:t>Validasi ketat, checkpoint multi-key, atomic write, rollback penuh, dan konfirmasi replace lolos.</w:t>
+              <w:t>Lokal saja (Menunggu push)</w:t>
             </w:r>
           </w:p>
         </w:tc>
@@ -525,57 +224,47 @@
         <w:pStyle w:val="Heading1"/>
       </w:pPr>
       <w:r>
-        <w:t>5. Hasil Verifikasi Aktual Lengkap</w:t>
+        <w:t>2. Verifikasi Aktual</w:t>
       </w:r>
     </w:p>
     <w:tbl>
       <w:tblPr>
         <w:tblW w:type="auto" w:w="0"/>
-        <w:jc w:val="center"/>
         <w:tblLook w:firstColumn="1" w:firstRow="1" w:lastColumn="0" w:lastRow="0" w:noHBand="0" w:noVBand="1" w:val="04A0"/>
       </w:tblPr>
       <w:tblGrid>
-        <w:gridCol w:w="3120"/>
-        <w:gridCol w:w="3120"/>
-        <w:gridCol w:w="3120"/>
+        <w:gridCol w:w="2880"/>
+        <w:gridCol w:w="2880"/>
+        <w:gridCol w:w="2880"/>
       </w:tblGrid>
       <w:tr>
         <w:tc>
           <w:tcPr>
-            <w:tcW w:type="dxa" w:w="3120"/>
+            <w:tcW w:type="dxa" w:w="2880"/>
           </w:tcPr>
           <w:p>
             <w:r>
-              <w:rPr>
-                <w:b/>
-              </w:rPr>
-              <w:t>Perintah Verifikasi</w:t>
+              <w:t>Pemeriksaan</w:t>
             </w:r>
           </w:p>
         </w:tc>
         <w:tc>
           <w:tcPr>
-            <w:tcW w:type="dxa" w:w="3120"/>
+            <w:tcW w:type="dxa" w:w="2880"/>
           </w:tcPr>
           <w:p>
             <w:r>
-              <w:rPr>
-                <w:b/>
-              </w:rPr>
-              <w:t>Status</w:t>
+              <w:t>Hasil</w:t>
             </w:r>
           </w:p>
         </w:tc>
         <w:tc>
           <w:tcPr>
-            <w:tcW w:type="dxa" w:w="3120"/>
+            <w:tcW w:type="dxa" w:w="2880"/>
           </w:tcPr>
           <w:p>
             <w:r>
-              <w:rPr>
-                <w:b/>
-              </w:rPr>
-              <w:t>Hasil Aktual</w:t>
+              <w:t>Keterangan</w:t>
             </w:r>
           </w:p>
         </w:tc>
@@ -583,38 +272,31 @@
       <w:tr>
         <w:tc>
           <w:tcPr>
-            <w:tcW w:type="dxa" w:w="3120"/>
+            <w:tcW w:type="dxa" w:w="2880"/>
           </w:tcPr>
           <w:p>
             <w:r>
-              <w:rPr>
-                <w:b/>
-              </w:rPr>
-              <w:t>pnpm install --frozen-lockfile</w:t>
+              <w:t>pnpm test</w:t>
             </w:r>
           </w:p>
         </w:tc>
         <w:tc>
           <w:tcPr>
-            <w:tcW w:type="dxa" w:w="3120"/>
+            <w:tcW w:type="dxa" w:w="2880"/>
           </w:tcPr>
           <w:p>
             <w:r>
-              <w:rPr>
-                <w:b/>
-                <w:color w:val="16A34A"/>
-              </w:rPr>
-              <w:t>PASS</w:t>
+              <w:t>PASS (34 Regr + 3 Scan)</w:t>
             </w:r>
           </w:p>
         </w:tc>
         <w:tc>
           <w:tcPr>
-            <w:tcW w:type="dxa" w:w="3120"/>
+            <w:tcW w:type="dxa" w:w="2880"/>
           </w:tcPr>
           <w:p>
             <w:r>
-              <w:t>Dependencies sinkron, tidak ada paket baru</w:t>
+              <w:t>34 regression tests + 3 scanner security checks</w:t>
             </w:r>
           </w:p>
         </w:tc>
@@ -622,38 +304,31 @@
       <w:tr>
         <w:tc>
           <w:tcPr>
-            <w:tcW w:type="dxa" w:w="3120"/>
+            <w:tcW w:type="dxa" w:w="2880"/>
           </w:tcPr>
           <w:p>
             <w:r>
-              <w:rPr>
-                <w:b/>
-              </w:rPr>
-              <w:t>pnpm test</w:t>
+              <w:t>TypeScript (tsc)</w:t>
             </w:r>
           </w:p>
         </w:tc>
         <w:tc>
           <w:tcPr>
-            <w:tcW w:type="dxa" w:w="3120"/>
+            <w:tcW w:type="dxa" w:w="2880"/>
           </w:tcPr>
           <w:p>
             <w:r>
-              <w:rPr>
-                <w:b/>
-                <w:color w:val="16A34A"/>
-              </w:rPr>
               <w:t>PASS</w:t>
             </w:r>
           </w:p>
         </w:tc>
         <w:tc>
           <w:tcPr>
-            <w:tcW w:type="dxa" w:w="3120"/>
+            <w:tcW w:type="dxa" w:w="2880"/>
           </w:tcPr>
           <w:p>
             <w:r>
-              <w:t>41 functional regression tests passed + 1 security scan passed</w:t>
+              <w:t>0 type error</w:t>
             </w:r>
           </w:p>
         </w:tc>
@@ -661,38 +336,31 @@
       <w:tr>
         <w:tc>
           <w:tcPr>
-            <w:tcW w:type="dxa" w:w="3120"/>
+            <w:tcW w:type="dxa" w:w="2880"/>
           </w:tcPr>
           <w:p>
             <w:r>
-              <w:rPr>
-                <w:b/>
-              </w:rPr>
-              <w:t>node scripts/test-budget-logic.mjs</w:t>
+              <w:t>Web Build (Turbopack)</w:t>
             </w:r>
           </w:p>
         </w:tc>
         <w:tc>
           <w:tcPr>
-            <w:tcW w:type="dxa" w:w="3120"/>
+            <w:tcW w:type="dxa" w:w="2880"/>
           </w:tcPr>
           <w:p>
             <w:r>
-              <w:rPr>
-                <w:b/>
-                <w:color w:val="16A34A"/>
-              </w:rPr>
               <w:t>PASS</w:t>
             </w:r>
           </w:p>
         </w:tc>
         <w:tc>
           <w:tcPr>
-            <w:tcW w:type="dxa" w:w="3120"/>
+            <w:tcW w:type="dxa" w:w="2880"/>
           </w:tcPr>
           <w:p>
             <w:r>
-              <w:t>7/7 passed (Logika hierarki budget SakuKilat)</w:t>
+              <w:t>Next.js production build sukses</w:t>
             </w:r>
           </w:p>
         </w:tc>
@@ -700,38 +368,31 @@
       <w:tr>
         <w:tc>
           <w:tcPr>
-            <w:tcW w:type="dxa" w:w="3120"/>
+            <w:tcW w:type="dxa" w:w="2880"/>
           </w:tcPr>
           <w:p>
             <w:r>
-              <w:rPr>
-                <w:b/>
-              </w:rPr>
-              <w:t>node scripts/test-storage-corruption.mjs</w:t>
+              <w:t>Mobile Export</w:t>
             </w:r>
           </w:p>
         </w:tc>
         <w:tc>
           <w:tcPr>
-            <w:tcW w:type="dxa" w:w="3120"/>
+            <w:tcW w:type="dxa" w:w="2880"/>
           </w:tcPr>
           <w:p>
             <w:r>
-              <w:rPr>
-                <w:b/>
-                <w:color w:val="16A34A"/>
-              </w:rPr>
               <w:t>PASS</w:t>
             </w:r>
           </w:p>
         </w:tc>
         <w:tc>
           <w:tcPr>
-            <w:tcW w:type="dxa" w:w="3120"/>
+            <w:tcW w:type="dxa" w:w="2880"/>
           </w:tcPr>
           <w:p>
             <w:r>
-              <w:t>18/18 passed (Pengujian langsung lib/storage.ts)</w:t>
+              <w:t>Static export out/ sukses</w:t>
             </w:r>
           </w:p>
         </w:tc>
@@ -739,310 +400,31 @@
       <w:tr>
         <w:tc>
           <w:tcPr>
-            <w:tcW w:type="dxa" w:w="3120"/>
+            <w:tcW w:type="dxa" w:w="2880"/>
           </w:tcPr>
           <w:p>
             <w:r>
-              <w:rPr>
-                <w:b/>
-              </w:rPr>
-              <w:t>node scripts/test-import-restore.mjs</w:t>
+              <w:t>Android Gradle</w:t>
             </w:r>
           </w:p>
         </w:tc>
         <w:tc>
           <w:tcPr>
-            <w:tcW w:type="dxa" w:w="3120"/>
+            <w:tcW w:type="dxa" w:w="2880"/>
           </w:tcPr>
           <w:p>
             <w:r>
-              <w:rPr>
-                <w:b/>
-                <w:color w:val="16A34A"/>
-              </w:rPr>
-              <w:t>PASS</w:t>
-            </w:r>
-          </w:p>
-        </w:tc>
-        <w:tc>
-          <w:tcPr>
-            <w:tcW w:type="dxa" w:w="3120"/>
-          </w:tcPr>
-          <w:p>
-            <w:r>
-              <w:t>16/16 passed (Pengujian langsung lib/data-restore.ts)</w:t>
-            </w:r>
-          </w:p>
-        </w:tc>
-      </w:tr>
-      <w:tr>
-        <w:tc>
-          <w:tcPr>
-            <w:tcW w:type="dxa" w:w="3120"/>
-          </w:tcPr>
-          <w:p>
-            <w:r>
-              <w:rPr>
-                <w:b/>
-              </w:rPr>
-              <w:t>node scripts/scan-personal-data.mjs</w:t>
-            </w:r>
-          </w:p>
-        </w:tc>
-        <w:tc>
-          <w:tcPr>
-            <w:tcW w:type="dxa" w:w="3120"/>
-          </w:tcPr>
-          <w:p>
-            <w:r>
-              <w:rPr>
-                <w:b/>
-                <w:color w:val="16A34A"/>
-              </w:rPr>
-              <w:t>PASS</w:t>
-            </w:r>
-          </w:p>
-        </w:tc>
-        <w:tc>
-          <w:tcPr>
-            <w:tcW w:type="dxa" w:w="3120"/>
-          </w:tcPr>
-          <w:p>
-            <w:r>
-              <w:t>3/3 checks passed (Tracked files bebas aset personal)</w:t>
-            </w:r>
-          </w:p>
-        </w:tc>
-      </w:tr>
-      <w:tr>
-        <w:tc>
-          <w:tcPr>
-            <w:tcW w:type="dxa" w:w="3120"/>
-          </w:tcPr>
-          <w:p>
-            <w:r>
-              <w:rPr>
-                <w:b/>
-              </w:rPr>
-              <w:t>pnpm exec tsc --noEmit</w:t>
-            </w:r>
-          </w:p>
-        </w:tc>
-        <w:tc>
-          <w:tcPr>
-            <w:tcW w:type="dxa" w:w="3120"/>
-          </w:tcPr>
-          <w:p>
-            <w:r>
-              <w:rPr>
-                <w:b/>
-                <w:color w:val="16A34A"/>
-              </w:rPr>
-              <w:t>PASS</w:t>
-            </w:r>
-          </w:p>
-        </w:tc>
-        <w:tc>
-          <w:tcPr>
-            <w:tcW w:type="dxa" w:w="3120"/>
-          </w:tcPr>
-          <w:p>
-            <w:r>
-              <w:t>0 error TypeScript</w:t>
-            </w:r>
-          </w:p>
-        </w:tc>
-      </w:tr>
-      <w:tr>
-        <w:tc>
-          <w:tcPr>
-            <w:tcW w:type="dxa" w:w="3120"/>
-          </w:tcPr>
-          <w:p>
-            <w:r>
-              <w:rPr>
-                <w:b/>
-              </w:rPr>
-              <w:t>pnpm build</w:t>
-            </w:r>
-          </w:p>
-        </w:tc>
-        <w:tc>
-          <w:tcPr>
-            <w:tcW w:type="dxa" w:w="3120"/>
-          </w:tcPr>
-          <w:p>
-            <w:r>
-              <w:rPr>
-                <w:b/>
-                <w:color w:val="16A34A"/>
-              </w:rPr>
-              <w:t>PASS</w:t>
-            </w:r>
-          </w:p>
-        </w:tc>
-        <w:tc>
-          <w:tcPr>
-            <w:tcW w:type="dxa" w:w="3120"/>
-          </w:tcPr>
-          <w:p>
-            <w:r>
-              <w:t>Next.js Turbopack compiled + static pages generated</w:t>
-            </w:r>
-          </w:p>
-        </w:tc>
-      </w:tr>
-      <w:tr>
-        <w:tc>
-          <w:tcPr>
-            <w:tcW w:type="dxa" w:w="3120"/>
-          </w:tcPr>
-          <w:p>
-            <w:r>
-              <w:rPr>
-                <w:b/>
-              </w:rPr>
-              <w:t>pnpm build:mobile</w:t>
-            </w:r>
-          </w:p>
-        </w:tc>
-        <w:tc>
-          <w:tcPr>
-            <w:tcW w:type="dxa" w:w="3120"/>
-          </w:tcPr>
-          <w:p>
-            <w:r>
-              <w:rPr>
-                <w:b/>
-                <w:color w:val="16A34A"/>
-              </w:rPr>
-              <w:t>PASS</w:t>
-            </w:r>
-          </w:p>
-        </w:tc>
-        <w:tc>
-          <w:tcPr>
-            <w:tcW w:type="dxa" w:w="3120"/>
-          </w:tcPr>
-          <w:p>
-            <w:r>
-              <w:t>Mode mobile static export berhasil dibuat ke folder out</w:t>
-            </w:r>
-          </w:p>
-        </w:tc>
-      </w:tr>
-      <w:tr>
-        <w:tc>
-          <w:tcPr>
-            <w:tcW w:type="dxa" w:w="3120"/>
-          </w:tcPr>
-          <w:p>
-            <w:r>
-              <w:rPr>
-                <w:b/>
-              </w:rPr>
-              <w:t>gradlew assemblePublicDebug</w:t>
-            </w:r>
-          </w:p>
-        </w:tc>
-        <w:tc>
-          <w:tcPr>
-            <w:tcW w:type="dxa" w:w="3120"/>
-          </w:tcPr>
-          <w:p>
-            <w:r>
-              <w:rPr>
-                <w:b/>
-                <w:color w:val="D97706"/>
-              </w:rPr>
               <w:t>BLOCKED</w:t>
             </w:r>
           </w:p>
         </w:tc>
         <w:tc>
           <w:tcPr>
-            <w:tcW w:type="dxa" w:w="3120"/>
+            <w:tcW w:type="dxa" w:w="2880"/>
           </w:tcPr>
           <w:p>
             <w:r>
-              <w:t>JAVA_HOME belum dikonfigurasi di PATH terminal lokal</w:t>
-            </w:r>
-          </w:p>
-        </w:tc>
-      </w:tr>
-      <w:tr>
-        <w:tc>
-          <w:tcPr>
-            <w:tcW w:type="dxa" w:w="3120"/>
-          </w:tcPr>
-          <w:p>
-            <w:r>
-              <w:rPr>
-                <w:b/>
-              </w:rPr>
-              <w:t>git diff --check &amp; git status</w:t>
-            </w:r>
-          </w:p>
-        </w:tc>
-        <w:tc>
-          <w:tcPr>
-            <w:tcW w:type="dxa" w:w="3120"/>
-          </w:tcPr>
-          <w:p>
-            <w:r>
-              <w:rPr>
-                <w:b/>
-                <w:color w:val="2563EB"/>
-              </w:rPr>
-              <w:t>CLEAN</w:t>
-            </w:r>
-          </w:p>
-        </w:tc>
-        <w:tc>
-          <w:tcPr>
-            <w:tcW w:type="dxa" w:w="3120"/>
-          </w:tcPr>
-          <w:p>
-            <w:r>
-              <w:t>Working tree bersih, 0 uncommitted changes</w:t>
-            </w:r>
-          </w:p>
-        </w:tc>
-      </w:tr>
-      <w:tr>
-        <w:tc>
-          <w:tcPr>
-            <w:tcW w:type="dxa" w:w="3120"/>
-          </w:tcPr>
-          <w:p>
-            <w:r>
-              <w:rPr>
-                <w:b/>
-              </w:rPr>
-              <w:t>git rev-list HEAD...origin/main</w:t>
-            </w:r>
-          </w:p>
-        </w:tc>
-        <w:tc>
-          <w:tcPr>
-            <w:tcW w:type="dxa" w:w="3120"/>
-          </w:tcPr>
-          <w:p>
-            <w:r>
-              <w:rPr>
-                <w:b/>
-              </w:rPr>
-              <w:t>AHEAD</w:t>
-            </w:r>
-          </w:p>
-        </w:tc>
-        <w:tc>
-          <w:tcPr>
-            <w:tcW w:type="dxa" w:w="3120"/>
-          </w:tcPr>
-          <w:p>
-            <w:r>
-              <w:t>11 commits ahead, 0 behind</w:t>
+              <w:t>JAVA_HOME belum dikonfigurasi di environment Windows</w:t>
             </w:r>
           </w:p>
         </w:tc>
@@ -1053,68 +435,22 @@
         <w:pStyle w:val="Heading1"/>
       </w:pPr>
       <w:r>
-        <w:t>6. Rincian Commit Baru di Repositori</w:t>
+        <w:t>3. Persetujuan yang Dibutuhkan dari Owner</w:t>
       </w:r>
     </w:p>
     <w:p>
       <w:r>
-        <w:t>1. b8bf646 — security(SK-001): contain personal data exposure — remove tracked asset and add gitignore/scan</w:t>
-        <w:br/>
-        <w:t>2. 2971aeb — test(SK-003): add storage corruption regression tests — expect 7 failures before fix</w:t>
-        <w:br/>
-        <w:t>3. 1e3e659 — fix(SK-003): quarantine corrupt state instead of overwriting with empty defaults</w:t>
-        <w:br/>
-        <w:t>4. e3b0419 — test(SK-004): add import/restore regression tests — expect 3 failures before fix</w:t>
-        <w:br/>
-        <w:t>5. e4b84a9 — fix(SK-004): add pre-import checkpoint, schema validation, write verification, and accurate copy text</w:t>
-        <w:br/>
-        <w:t>6. 4a4b6cd — test(SK-003): exercise production storage recovery path (RED)</w:t>
-        <w:br/>
-        <w:t>7. 74d3bbd — fix(SK-003): block mutations and expose corrupt-state recovery (GREEN)</w:t>
-        <w:br/>
-        <w:t>8. 1fb7cf9 — test(SK-004): exercise production transactional restore (RED)</w:t>
-        <w:br/>
-        <w:t>9. 1e2a0b3 — fix(SK-004): validate, checkpoint, confirm, and rollback restore (GREEN)</w:t>
-        <w:br/>
-        <w:t>10. 1450a10 — test(SK-001): wire personal-data scan into default gate</w:t>
-        <w:br/>
-        <w:t>11. e2b0308 — docs: correct Phase 0 remediation report</w:t>
-      </w:r>
-    </w:p>
-    <w:p>
-      <w:pPr>
-        <w:pStyle w:val="Heading1"/>
-      </w:pPr>
-      <w:r>
-        <w:t>7. Tindakan yang Menunggu Persetujuan Owner</w:t>
+        <w:t>A. Persetujuan Normal Push 13 Commit ke origin/main: Menghapus data personal dari HEAD remote publik (Risiko: Rendah).</w:t>
       </w:r>
     </w:p>
     <w:p>
       <w:r>
-        <w:t>Sesuai protokol keamanan dan integritas Git, tidak ada tindakan push atau modifikasi remote yang dilakukan otomatis. Dua keputusan terpisah menunggu konfirmasi Owner:</w:t>
-        <w:br/>
-        <w:br/>
-        <w:t>1. PERSETUJUAN A — Normal Push 11 Commit ke origin/main:</w:t>
-        <w:br/>
-        <w:t xml:space="preserve">   Aksi: git push origin main</w:t>
-        <w:br/>
-        <w:t xml:space="preserve">   Tujuan: Menghapus file personal dari remote HEAD publik dan mengaktifkan perbaikan SK-001, SK-003, SK-004 di GitHub.</w:t>
-        <w:br/>
-        <w:t xml:space="preserve">   Tingkat Risiko: Rendah (Operasi Git normal, fast-forward).</w:t>
-        <w:br/>
-        <w:br/>
-        <w:t>2. PERSETUJUAN B — Rewrite History &amp; Force-Push (Purge Permanen):</w:t>
-        <w:br/>
-        <w:t xml:space="preserve">   Aksi: Menjalankan git-filter-repo / BFG untuk menghapus blob preloaded-state.json dari commit 97e04aa di seluruh histori Git publik, diikuti git push --force.</w:t>
-        <w:br/>
-        <w:t xml:space="preserve">   Tujuan: Membersihkan riwayat lama secara permanen dari server GitHub.</w:t>
-        <w:br/>
-        <w:t xml:space="preserve">   Tingkat Risiko: Sangat Tinggi (Destruktif pada riwayat Git, mengubah SHA commit, memutus fork/clone yang ada).</w:t>
+        <w:t>B. Persetujuan History Purge &amp; Force Push: Menghapus blob personal dari commit lama menggunakan git-filter-repo/BFG (Risiko: Tinggi).</w:t>
       </w:r>
     </w:p>
     <w:sectPr>
       <w:pgSz w:w="12240" w:h="15840"/>
-      <w:pgMar w:top="1440" w:right="1440" w:bottom="1440" w:left="1440" w:header="720" w:footer="720" w:gutter="0"/>
+      <w:pgMar w:top="1440" w:right="1800" w:bottom="1440" w:left="1800" w:header="720" w:footer="720" w:gutter="0"/>
       <w:cols w:space="720"/>
       <w:docGrid w:linePitch="360"/>
     </w:sectPr>

</xml_diff>

<commit_message>
docs: finalize Phase 0 remediation reports in DOCX, HTML, and Markdown format
</commit_message>
<xml_diff>
--- a/docs/LAPORAN_REMEDIASI_PHASE0_SAKUKILAT.docx
+++ b/docs/LAPORAN_REMEDIASI_PHASE0_SAKUKILAT.docx
@@ -4,31 +4,259 @@
   <w:body>
     <w:p>
       <w:pPr>
-        <w:pStyle w:val="Title"/>
+        <w:jc w:val="center"/>
       </w:pPr>
       <w:r>
-        <w:t>SAKUKILAT REMEDIATION PHASE 0 — LAPORAN RESMI</w:t>
+        <w:rPr>
+          <w:rFonts w:ascii="Arial" w:hAnsi="Arial"/>
+          <w:b/>
+          <w:color w:val="0F2A4A"/>
+          <w:sz w:val="36"/>
+        </w:rPr>
+        <w:t>SAKUKILAT REMEDIATION PHASE 0</w:t>
+        <w:br/>
+        <w:t>LAPORAN KOREKSI DAN PENYELESAIAN RESMI</w:t>
       </w:r>
     </w:p>
+    <w:tbl>
+      <w:tblPr>
+        <w:tblW w:type="auto" w:w="0"/>
+        <w:jc w:val="center"/>
+        <w:tblLook w:firstColumn="1" w:firstRow="1" w:lastColumn="0" w:lastRow="0" w:noHBand="0" w:noVBand="1" w:val="04A0"/>
+      </w:tblPr>
+      <w:tblGrid>
+        <w:gridCol w:w="4968"/>
+        <w:gridCol w:w="4968"/>
+      </w:tblGrid>
+      <w:tr>
+        <w:tc>
+          <w:tcPr>
+            <w:tcW w:type="dxa" w:w="3168"/>
+            <w:shd w:fill="F0F4F8"/>
+            <w:tcMar>
+              <w:top w:w="80" w:type="dxa"/>
+              <w:bottom w:w="80" w:type="dxa"/>
+              <w:left w:w="120" w:type="dxa"/>
+              <w:right w:w="120" w:type="dxa"/>
+            </w:tcMar>
+          </w:tcPr>
+          <w:p>
+            <w:r>
+              <w:rPr>
+                <w:b/>
+                <w:sz w:val="19"/>
+              </w:rPr>
+              <w:t>Tanggal Pelaksanaan</w:t>
+            </w:r>
+          </w:p>
+        </w:tc>
+        <w:tc>
+          <w:tcPr>
+            <w:tcW w:type="dxa" w:w="6912"/>
+            <w:shd w:fill="F8FAFC"/>
+            <w:tcMar>
+              <w:top w:w="80" w:type="dxa"/>
+              <w:bottom w:w="80" w:type="dxa"/>
+              <w:left w:w="120" w:type="dxa"/>
+              <w:right w:w="120" w:type="dxa"/>
+            </w:tcMar>
+          </w:tcPr>
+          <w:p>
+            <w:r>
+              <w:rPr>
+                <w:sz w:val="19"/>
+              </w:rPr>
+              <w:t>10 September 2026</w:t>
+            </w:r>
+          </w:p>
+        </w:tc>
+      </w:tr>
+      <w:tr>
+        <w:tc>
+          <w:tcPr>
+            <w:tcW w:type="dxa" w:w="3168"/>
+            <w:shd w:fill="F0F4F8"/>
+            <w:tcMar>
+              <w:top w:w="80" w:type="dxa"/>
+              <w:bottom w:w="80" w:type="dxa"/>
+              <w:left w:w="120" w:type="dxa"/>
+              <w:right w:w="120" w:type="dxa"/>
+            </w:tcMar>
+          </w:tcPr>
+          <w:p>
+            <w:r>
+              <w:rPr>
+                <w:b/>
+                <w:sz w:val="19"/>
+              </w:rPr>
+              <w:t>Baseline Awal</w:t>
+            </w:r>
+          </w:p>
+        </w:tc>
+        <w:tc>
+          <w:tcPr>
+            <w:tcW w:type="dxa" w:w="6912"/>
+            <w:shd w:fill="F8FAFC"/>
+            <w:tcMar>
+              <w:top w:w="80" w:type="dxa"/>
+              <w:bottom w:w="80" w:type="dxa"/>
+              <w:left w:w="120" w:type="dxa"/>
+              <w:right w:w="120" w:type="dxa"/>
+            </w:tcMar>
+          </w:tcPr>
+          <w:p>
+            <w:r>
+              <w:rPr>
+                <w:sz w:val="19"/>
+              </w:rPr>
+              <w:t>main @ 7707ab86adde25c47149a7d80ff1eca76c177673</w:t>
+            </w:r>
+          </w:p>
+        </w:tc>
+      </w:tr>
+      <w:tr>
+        <w:tc>
+          <w:tcPr>
+            <w:tcW w:type="dxa" w:w="3168"/>
+            <w:shd w:fill="F0F4F8"/>
+            <w:tcMar>
+              <w:top w:w="80" w:type="dxa"/>
+              <w:bottom w:w="80" w:type="dxa"/>
+              <w:left w:w="120" w:type="dxa"/>
+              <w:right w:w="120" w:type="dxa"/>
+            </w:tcMar>
+          </w:tcPr>
+          <w:p>
+            <w:r>
+              <w:rPr>
+                <w:b/>
+                <w:sz w:val="19"/>
+              </w:rPr>
+              <w:t>Current Local HEAD</w:t>
+            </w:r>
+          </w:p>
+        </w:tc>
+        <w:tc>
+          <w:tcPr>
+            <w:tcW w:type="dxa" w:w="6912"/>
+            <w:shd w:fill="F8FAFC"/>
+            <w:tcMar>
+              <w:top w:w="80" w:type="dxa"/>
+              <w:bottom w:w="80" w:type="dxa"/>
+              <w:left w:w="120" w:type="dxa"/>
+              <w:right w:w="120" w:type="dxa"/>
+            </w:tcMar>
+          </w:tcPr>
+          <w:p>
+            <w:r>
+              <w:rPr>
+                <w:sz w:val="19"/>
+              </w:rPr>
+              <w:t>f689225 (14 commits ahead of origin/main)</w:t>
+            </w:r>
+          </w:p>
+        </w:tc>
+      </w:tr>
+      <w:tr>
+        <w:tc>
+          <w:tcPr>
+            <w:tcW w:type="dxa" w:w="3168"/>
+            <w:shd w:fill="F0F4F8"/>
+            <w:tcMar>
+              <w:top w:w="80" w:type="dxa"/>
+              <w:bottom w:w="80" w:type="dxa"/>
+              <w:left w:w="120" w:type="dxa"/>
+              <w:right w:w="120" w:type="dxa"/>
+            </w:tcMar>
+          </w:tcPr>
+          <w:p>
+            <w:r>
+              <w:rPr>
+                <w:b/>
+                <w:sz w:val="19"/>
+              </w:rPr>
+              <w:t>Repository</w:t>
+            </w:r>
+          </w:p>
+        </w:tc>
+        <w:tc>
+          <w:tcPr>
+            <w:tcW w:type="dxa" w:w="6912"/>
+            <w:shd w:fill="F8FAFC"/>
+            <w:tcMar>
+              <w:top w:w="80" w:type="dxa"/>
+              <w:bottom w:w="80" w:type="dxa"/>
+              <w:left w:w="120" w:type="dxa"/>
+              <w:right w:w="120" w:type="dxa"/>
+            </w:tcMar>
+          </w:tcPr>
+          <w:p>
+            <w:r>
+              <w:rPr>
+                <w:sz w:val="19"/>
+              </w:rPr>
+              <w:t>C:\Users\HYPE AMD\Projects\SakuKilat</w:t>
+            </w:r>
+          </w:p>
+        </w:tc>
+      </w:tr>
+      <w:tr>
+        <w:tc>
+          <w:tcPr>
+            <w:tcW w:type="dxa" w:w="3168"/>
+            <w:shd w:fill="F0F4F8"/>
+            <w:tcMar>
+              <w:top w:w="80" w:type="dxa"/>
+              <w:bottom w:w="80" w:type="dxa"/>
+              <w:left w:w="120" w:type="dxa"/>
+              <w:right w:w="120" w:type="dxa"/>
+            </w:tcMar>
+          </w:tcPr>
+          <w:p>
+            <w:r>
+              <w:rPr>
+                <w:b/>
+                <w:sz w:val="19"/>
+              </w:rPr>
+              <w:t>Status Resmi Fase 0</w:t>
+            </w:r>
+          </w:p>
+        </w:tc>
+        <w:tc>
+          <w:tcPr>
+            <w:tcW w:type="dxa" w:w="6912"/>
+            <w:shd w:fill="F8FAFC"/>
+            <w:tcMar>
+              <w:top w:w="80" w:type="dxa"/>
+              <w:bottom w:w="80" w:type="dxa"/>
+              <w:left w:w="120" w:type="dxa"/>
+              <w:right w:w="120" w:type="dxa"/>
+            </w:tcMar>
+          </w:tcPr>
+          <w:p>
+            <w:r>
+              <w:rPr>
+                <w:b/>
+                <w:color w:val="0A6644"/>
+                <w:sz w:val="19"/>
+              </w:rPr>
+              <w:t>LOCAL REMEDIATION COMPLETE — REMOTE HEAD &amp; HISTORY PURGE PENDING OWNER APPROVAL</w:t>
+            </w:r>
+          </w:p>
+        </w:tc>
+      </w:tr>
+    </w:tbl>
+    <w:p/>
     <w:p>
       <w:r>
         <w:rPr>
-          <w:b/>
+          <w:i/>
+          <w:color w:val="555555"/>
+          <w:sz w:val="19"/>
         </w:rPr>
-        <w:t>Tanggal: 10 September 2026</w:t>
+        <w:t>Catatan Kepatuhan &amp; Transparansi:</w:t>
         <w:br/>
-      </w:r>
-      <w:r>
-        <w:t>Baseline: main @ 7707ab86</w:t>
-        <w:br/>
-      </w:r>
-      <w:r>
-        <w:t>Current Local HEAD: 20d340a (13 commits ahead of origin/main)</w:t>
-        <w:br/>
-      </w:r>
-      <w:r>
-        <w:t>Status: LOCAL REMEDIATION COMPLETE — REMOTE HEAD &amp; HISTORY PURGE PENDING OWNER APPROVAL</w:t>
-        <w:br/>
+        <w:t>Laporan ini mengoreksi secara jujur klaim awal 'Phase 0 Complete'. Perlindungan kode lokal, validasi integritas data, dan regression test langsung terhadap kode produksi telah selesai 100%. Tidak ada data personal pada working tree lokal, mutasi saat storage rusak telah diblokir, restore transaksional multi-key telah aktif, dan 34 regression tests lulus. Tindakan remote push dan history purge membutuhkan persetujuan eksplisit owner sesuai DEV-PROTOCOL.</w:t>
       </w:r>
     </w:p>
     <w:p>
@@ -36,58 +264,110 @@
         <w:pStyle w:val="Heading1"/>
       </w:pPr>
       <w:r>
-        <w:t>1. Ringkasan Status dan Temuan</w:t>
+        <w:rPr>
+          <w:color w:val="0F2A4A"/>
+        </w:rPr>
+        <w:t>1. Ringkasan Eksekusi &amp; Daftar 14 Commit</w:t>
       </w:r>
     </w:p>
     <w:tbl>
       <w:tblPr>
         <w:tblW w:type="auto" w:w="0"/>
+        <w:jc w:val="center"/>
         <w:tblLook w:firstColumn="1" w:firstRow="1" w:lastColumn="0" w:lastRow="0" w:noHBand="0" w:noVBand="1" w:val="04A0"/>
       </w:tblPr>
       <w:tblGrid>
-        <w:gridCol w:w="2160"/>
-        <w:gridCol w:w="2160"/>
-        <w:gridCol w:w="2160"/>
-        <w:gridCol w:w="2160"/>
+        <w:gridCol w:w="2484"/>
+        <w:gridCol w:w="2484"/>
+        <w:gridCol w:w="2484"/>
+        <w:gridCol w:w="2484"/>
       </w:tblGrid>
       <w:tr>
         <w:tc>
           <w:tcPr>
-            <w:tcW w:type="dxa" w:w="2160"/>
+            <w:tcW w:type="dxa" w:w="576"/>
+            <w:shd w:fill="0F2A4A"/>
+            <w:tcMar>
+              <w:top w:w="80" w:type="dxa"/>
+              <w:bottom w:w="80" w:type="dxa"/>
+              <w:left w:w="100" w:type="dxa"/>
+              <w:right w:w="100" w:type="dxa"/>
+            </w:tcMar>
           </w:tcPr>
           <w:p>
             <w:r>
+              <w:rPr>
+                <w:b/>
+                <w:color w:val="FFFFFF"/>
+                <w:sz w:val="18"/>
+              </w:rPr>
+              <w:t>#</w:t>
+            </w:r>
+          </w:p>
+        </w:tc>
+        <w:tc>
+          <w:tcPr>
+            <w:tcW w:type="dxa" w:w="1584"/>
+            <w:shd w:fill="0F2A4A"/>
+            <w:tcMar>
+              <w:top w:w="80" w:type="dxa"/>
+              <w:bottom w:w="80" w:type="dxa"/>
+              <w:left w:w="100" w:type="dxa"/>
+              <w:right w:w="100" w:type="dxa"/>
+            </w:tcMar>
+          </w:tcPr>
+          <w:p>
+            <w:r>
+              <w:rPr>
+                <w:b/>
+                <w:color w:val="FFFFFF"/>
+                <w:sz w:val="18"/>
+              </w:rPr>
+              <w:t>Commit</w:t>
+            </w:r>
+          </w:p>
+        </w:tc>
+        <w:tc>
+          <w:tcPr>
+            <w:tcW w:type="dxa" w:w="1440"/>
+            <w:shd w:fill="0F2A4A"/>
+            <w:tcMar>
+              <w:top w:w="80" w:type="dxa"/>
+              <w:bottom w:w="80" w:type="dxa"/>
+              <w:left w:w="100" w:type="dxa"/>
+              <w:right w:w="100" w:type="dxa"/>
+            </w:tcMar>
+          </w:tcPr>
+          <w:p>
+            <w:r>
+              <w:rPr>
+                <w:b/>
+                <w:color w:val="FFFFFF"/>
+                <w:sz w:val="18"/>
+              </w:rPr>
               <w:t>Finding</w:t>
             </w:r>
           </w:p>
         </w:tc>
         <w:tc>
           <w:tcPr>
-            <w:tcW w:type="dxa" w:w="2160"/>
+            <w:tcW w:type="dxa" w:w="6480"/>
+            <w:shd w:fill="0F2A4A"/>
+            <w:tcMar>
+              <w:top w:w="80" w:type="dxa"/>
+              <w:bottom w:w="80" w:type="dxa"/>
+              <w:left w:w="100" w:type="dxa"/>
+              <w:right w:w="100" w:type="dxa"/>
+            </w:tcMar>
           </w:tcPr>
           <w:p>
             <w:r>
-              <w:t>Severity</w:t>
-            </w:r>
-          </w:p>
-        </w:tc>
-        <w:tc>
-          <w:tcPr>
-            <w:tcW w:type="dxa" w:w="2160"/>
-          </w:tcPr>
-          <w:p>
-            <w:r>
-              <w:t>Status Lokal</w:t>
-            </w:r>
-          </w:p>
-        </w:tc>
-        <w:tc>
-          <w:tcPr>
-            <w:tcW w:type="dxa" w:w="2160"/>
-          </w:tcPr>
-          <w:p>
-            <w:r>
-              <w:t>Status Remote / Git</w:t>
+              <w:rPr>
+                <w:b/>
+                <w:color w:val="FFFFFF"/>
+                <w:sz w:val="18"/>
+              </w:rPr>
+              <w:t>Deskripsi Perubahan</w:t>
             </w:r>
           </w:p>
         </w:tc>
@@ -95,41 +375,78 @@
       <w:tr>
         <w:tc>
           <w:tcPr>
-            <w:tcW w:type="dxa" w:w="2160"/>
+            <w:tcW w:type="dxa" w:w="576"/>
+            <w:tcMar>
+              <w:top w:w="60" w:type="dxa"/>
+              <w:bottom w:w="60" w:type="dxa"/>
+              <w:left w:w="80" w:type="dxa"/>
+              <w:right w:w="80" w:type="dxa"/>
+            </w:tcMar>
           </w:tcPr>
           <w:p>
             <w:r>
-              <w:t>SK-001 (Data Leak)</w:t>
+              <w:rPr>
+                <w:sz w:val="17"/>
+              </w:rPr>
+              <w:t>1</w:t>
             </w:r>
           </w:p>
         </w:tc>
         <w:tc>
           <w:tcPr>
-            <w:tcW w:type="dxa" w:w="2160"/>
+            <w:tcW w:type="dxa" w:w="1584"/>
+            <w:tcMar>
+              <w:top w:w="60" w:type="dxa"/>
+              <w:bottom w:w="60" w:type="dxa"/>
+              <w:left w:w="80" w:type="dxa"/>
+              <w:right w:w="80" w:type="dxa"/>
+            </w:tcMar>
           </w:tcPr>
           <w:p>
             <w:r>
-              <w:t>P0</w:t>
+              <w:rPr>
+                <w:rFonts w:ascii="Consolas" w:hAnsi="Consolas"/>
+                <w:sz w:val="17"/>
+              </w:rPr>
+              <w:t>b8bf646</w:t>
             </w:r>
           </w:p>
         </w:tc>
         <w:tc>
           <w:tcPr>
-            <w:tcW w:type="dxa" w:w="2160"/>
+            <w:tcW w:type="dxa" w:w="1440"/>
+            <w:tcMar>
+              <w:top w:w="60" w:type="dxa"/>
+              <w:bottom w:w="60" w:type="dxa"/>
+              <w:left w:w="80" w:type="dxa"/>
+              <w:right w:w="80" w:type="dxa"/>
+            </w:tcMar>
           </w:tcPr>
           <w:p>
             <w:r>
-              <w:t>CONTAINED (File dihapus, .gitignore aktif, scanner terhubung)</w:t>
+              <w:rPr>
+                <w:sz w:val="17"/>
+              </w:rPr>
+              <w:t>SK-001</w:t>
             </w:r>
           </w:p>
         </w:tc>
         <w:tc>
           <w:tcPr>
-            <w:tcW w:type="dxa" w:w="2160"/>
+            <w:tcW w:type="dxa" w:w="6480"/>
+            <w:tcMar>
+              <w:top w:w="60" w:type="dxa"/>
+              <w:bottom w:w="60" w:type="dxa"/>
+              <w:left w:w="80" w:type="dxa"/>
+              <w:right w:w="80" w:type="dxa"/>
+            </w:tcMar>
           </w:tcPr>
           <w:p>
             <w:r>
-              <w:t>EXPOSED (Ada di remote HEAD &amp; git history)</w:t>
+              <w:rPr>
+                <w:sz w:val="17"/>
+              </w:rPr>
+              <w:t>Hapus file data personal dari HEAD lokal, tambahkan .gitignore dan scanner aset</w:t>
             </w:r>
           </w:p>
         </w:tc>
@@ -137,41 +454,78 @@
       <w:tr>
         <w:tc>
           <w:tcPr>
-            <w:tcW w:type="dxa" w:w="2160"/>
+            <w:tcW w:type="dxa" w:w="576"/>
+            <w:tcMar>
+              <w:top w:w="60" w:type="dxa"/>
+              <w:bottom w:w="60" w:type="dxa"/>
+              <w:left w:w="80" w:type="dxa"/>
+              <w:right w:w="80" w:type="dxa"/>
+            </w:tcMar>
           </w:tcPr>
           <w:p>
             <w:r>
-              <w:t>SK-003 (Storage Corruption)</w:t>
+              <w:rPr>
+                <w:sz w:val="17"/>
+              </w:rPr>
+              <w:t>2</w:t>
             </w:r>
           </w:p>
         </w:tc>
         <w:tc>
           <w:tcPr>
-            <w:tcW w:type="dxa" w:w="2160"/>
+            <w:tcW w:type="dxa" w:w="1584"/>
+            <w:tcMar>
+              <w:top w:w="60" w:type="dxa"/>
+              <w:bottom w:w="60" w:type="dxa"/>
+              <w:left w:w="80" w:type="dxa"/>
+              <w:right w:w="80" w:type="dxa"/>
+            </w:tcMar>
           </w:tcPr>
           <w:p>
             <w:r>
-              <w:t>P0</w:t>
+              <w:rPr>
+                <w:rFonts w:ascii="Consolas" w:hAnsi="Consolas"/>
+                <w:sz w:val="17"/>
+              </w:rPr>
+              <w:t>2971aeb</w:t>
             </w:r>
           </w:p>
         </w:tc>
         <w:tc>
           <w:tcPr>
-            <w:tcW w:type="dxa" w:w="2160"/>
+            <w:tcW w:type="dxa" w:w="1440"/>
+            <w:tcMar>
+              <w:top w:w="60" w:type="dxa"/>
+              <w:bottom w:w="60" w:type="dxa"/>
+              <w:left w:w="80" w:type="dxa"/>
+              <w:right w:w="80" w:type="dxa"/>
+            </w:tcMar>
           </w:tcPr>
           <w:p>
             <w:r>
-              <w:t>RESOLVED (18/18 PASS, block mutations, Recovery UI)</w:t>
+              <w:rPr>
+                <w:sz w:val="17"/>
+              </w:rPr>
+              <w:t>SK-003</w:t>
             </w:r>
           </w:p>
         </w:tc>
         <w:tc>
           <w:tcPr>
-            <w:tcW w:type="dxa" w:w="2160"/>
+            <w:tcW w:type="dxa" w:w="6480"/>
+            <w:tcMar>
+              <w:top w:w="60" w:type="dxa"/>
+              <w:bottom w:w="60" w:type="dxa"/>
+              <w:left w:w="80" w:type="dxa"/>
+              <w:right w:w="80" w:type="dxa"/>
+            </w:tcMar>
           </w:tcPr>
           <w:p>
             <w:r>
-              <w:t>Lokal saja (Menunggu push)</w:t>
+              <w:rPr>
+                <w:sz w:val="17"/>
+              </w:rPr>
+              <w:t>Baseline awal test storage corruption (simulasi lokal)</w:t>
             </w:r>
           </w:p>
         </w:tc>
@@ -179,41 +533,947 @@
       <w:tr>
         <w:tc>
           <w:tcPr>
-            <w:tcW w:type="dxa" w:w="2160"/>
+            <w:tcW w:type="dxa" w:w="576"/>
+            <w:tcMar>
+              <w:top w:w="60" w:type="dxa"/>
+              <w:bottom w:w="60" w:type="dxa"/>
+              <w:left w:w="80" w:type="dxa"/>
+              <w:right w:w="80" w:type="dxa"/>
+            </w:tcMar>
           </w:tcPr>
           <w:p>
             <w:r>
-              <w:t>SK-004 (Restore Integrity)</w:t>
+              <w:rPr>
+                <w:sz w:val="17"/>
+              </w:rPr>
+              <w:t>3</w:t>
             </w:r>
           </w:p>
         </w:tc>
         <w:tc>
           <w:tcPr>
-            <w:tcW w:type="dxa" w:w="2160"/>
+            <w:tcW w:type="dxa" w:w="1584"/>
+            <w:tcMar>
+              <w:top w:w="60" w:type="dxa"/>
+              <w:bottom w:w="60" w:type="dxa"/>
+              <w:left w:w="80" w:type="dxa"/>
+              <w:right w:w="80" w:type="dxa"/>
+            </w:tcMar>
           </w:tcPr>
           <w:p>
             <w:r>
-              <w:t>P0</w:t>
+              <w:rPr>
+                <w:rFonts w:ascii="Consolas" w:hAnsi="Consolas"/>
+                <w:sz w:val="17"/>
+              </w:rPr>
+              <w:t>1e3e659</w:t>
             </w:r>
           </w:p>
         </w:tc>
         <w:tc>
           <w:tcPr>
-            <w:tcW w:type="dxa" w:w="2160"/>
+            <w:tcW w:type="dxa" w:w="1440"/>
+            <w:tcMar>
+              <w:top w:w="60" w:type="dxa"/>
+              <w:bottom w:w="60" w:type="dxa"/>
+              <w:left w:w="80" w:type="dxa"/>
+              <w:right w:w="80" w:type="dxa"/>
+            </w:tcMar>
           </w:tcPr>
           <w:p>
             <w:r>
-              <w:t>RESOLVED (16/16 PASS, multi-key checkpoint, rollback UI)</w:t>
+              <w:rPr>
+                <w:sz w:val="17"/>
+              </w:rPr>
+              <w:t>SK-003</w:t>
             </w:r>
           </w:p>
         </w:tc>
         <w:tc>
           <w:tcPr>
-            <w:tcW w:type="dxa" w:w="2160"/>
+            <w:tcW w:type="dxa" w:w="6480"/>
+            <w:tcMar>
+              <w:top w:w="60" w:type="dxa"/>
+              <w:bottom w:w="60" w:type="dxa"/>
+              <w:left w:w="80" w:type="dxa"/>
+              <w:right w:w="80" w:type="dxa"/>
+            </w:tcMar>
           </w:tcPr>
           <w:p>
             <w:r>
-              <w:t>Lokal saja (Menunggu push)</w:t>
+              <w:rPr>
+                <w:sz w:val="17"/>
+              </w:rPr>
+              <w:t>Implementasi awal karantina corrupt state di store.tsx</w:t>
+            </w:r>
+          </w:p>
+        </w:tc>
+      </w:tr>
+      <w:tr>
+        <w:tc>
+          <w:tcPr>
+            <w:tcW w:type="dxa" w:w="576"/>
+            <w:tcMar>
+              <w:top w:w="60" w:type="dxa"/>
+              <w:bottom w:w="60" w:type="dxa"/>
+              <w:left w:w="80" w:type="dxa"/>
+              <w:right w:w="80" w:type="dxa"/>
+            </w:tcMar>
+          </w:tcPr>
+          <w:p>
+            <w:r>
+              <w:rPr>
+                <w:sz w:val="17"/>
+              </w:rPr>
+              <w:t>4</w:t>
+            </w:r>
+          </w:p>
+        </w:tc>
+        <w:tc>
+          <w:tcPr>
+            <w:tcW w:type="dxa" w:w="1584"/>
+            <w:tcMar>
+              <w:top w:w="60" w:type="dxa"/>
+              <w:bottom w:w="60" w:type="dxa"/>
+              <w:left w:w="80" w:type="dxa"/>
+              <w:right w:w="80" w:type="dxa"/>
+            </w:tcMar>
+          </w:tcPr>
+          <w:p>
+            <w:r>
+              <w:rPr>
+                <w:rFonts w:ascii="Consolas" w:hAnsi="Consolas"/>
+                <w:sz w:val="17"/>
+              </w:rPr>
+              <w:t>e3b0419</w:t>
+            </w:r>
+          </w:p>
+        </w:tc>
+        <w:tc>
+          <w:tcPr>
+            <w:tcW w:type="dxa" w:w="1440"/>
+            <w:tcMar>
+              <w:top w:w="60" w:type="dxa"/>
+              <w:bottom w:w="60" w:type="dxa"/>
+              <w:left w:w="80" w:type="dxa"/>
+              <w:right w:w="80" w:type="dxa"/>
+            </w:tcMar>
+          </w:tcPr>
+          <w:p>
+            <w:r>
+              <w:rPr>
+                <w:sz w:val="17"/>
+              </w:rPr>
+              <w:t>SK-004</w:t>
+            </w:r>
+          </w:p>
+        </w:tc>
+        <w:tc>
+          <w:tcPr>
+            <w:tcW w:type="dxa" w:w="6480"/>
+            <w:tcMar>
+              <w:top w:w="60" w:type="dxa"/>
+              <w:bottom w:w="60" w:type="dxa"/>
+              <w:left w:w="80" w:type="dxa"/>
+              <w:right w:w="80" w:type="dxa"/>
+            </w:tcMar>
+          </w:tcPr>
+          <w:p>
+            <w:r>
+              <w:rPr>
+                <w:sz w:val="17"/>
+              </w:rPr>
+              <w:t>Baseline awal test import/restore (simulasi lokal)</w:t>
+            </w:r>
+          </w:p>
+        </w:tc>
+      </w:tr>
+      <w:tr>
+        <w:tc>
+          <w:tcPr>
+            <w:tcW w:type="dxa" w:w="576"/>
+            <w:tcMar>
+              <w:top w:w="60" w:type="dxa"/>
+              <w:bottom w:w="60" w:type="dxa"/>
+              <w:left w:w="80" w:type="dxa"/>
+              <w:right w:w="80" w:type="dxa"/>
+            </w:tcMar>
+          </w:tcPr>
+          <w:p>
+            <w:r>
+              <w:rPr>
+                <w:sz w:val="17"/>
+              </w:rPr>
+              <w:t>5</w:t>
+            </w:r>
+          </w:p>
+        </w:tc>
+        <w:tc>
+          <w:tcPr>
+            <w:tcW w:type="dxa" w:w="1584"/>
+            <w:tcMar>
+              <w:top w:w="60" w:type="dxa"/>
+              <w:bottom w:w="60" w:type="dxa"/>
+              <w:left w:w="80" w:type="dxa"/>
+              <w:right w:w="80" w:type="dxa"/>
+            </w:tcMar>
+          </w:tcPr>
+          <w:p>
+            <w:r>
+              <w:rPr>
+                <w:rFonts w:ascii="Consolas" w:hAnsi="Consolas"/>
+                <w:sz w:val="17"/>
+              </w:rPr>
+              <w:t>e4b84a9</w:t>
+            </w:r>
+          </w:p>
+        </w:tc>
+        <w:tc>
+          <w:tcPr>
+            <w:tcW w:type="dxa" w:w="1440"/>
+            <w:tcMar>
+              <w:top w:w="60" w:type="dxa"/>
+              <w:bottom w:w="60" w:type="dxa"/>
+              <w:left w:w="80" w:type="dxa"/>
+              <w:right w:w="80" w:type="dxa"/>
+            </w:tcMar>
+          </w:tcPr>
+          <w:p>
+            <w:r>
+              <w:rPr>
+                <w:sz w:val="17"/>
+              </w:rPr>
+              <w:t>SK-004</w:t>
+            </w:r>
+          </w:p>
+        </w:tc>
+        <w:tc>
+          <w:tcPr>
+            <w:tcW w:type="dxa" w:w="6480"/>
+            <w:tcMar>
+              <w:top w:w="60" w:type="dxa"/>
+              <w:bottom w:w="60" w:type="dxa"/>
+              <w:left w:w="80" w:type="dxa"/>
+              <w:right w:w="80" w:type="dxa"/>
+            </w:tcMar>
+          </w:tcPr>
+          <w:p>
+            <w:r>
+              <w:rPr>
+                <w:sz w:val="17"/>
+              </w:rPr>
+              <w:t>Implementasi awal checkpoint dan copy text di data-portability.tsx</w:t>
+            </w:r>
+          </w:p>
+        </w:tc>
+      </w:tr>
+      <w:tr>
+        <w:tc>
+          <w:tcPr>
+            <w:tcW w:type="dxa" w:w="576"/>
+            <w:tcMar>
+              <w:top w:w="60" w:type="dxa"/>
+              <w:bottom w:w="60" w:type="dxa"/>
+              <w:left w:w="80" w:type="dxa"/>
+              <w:right w:w="80" w:type="dxa"/>
+            </w:tcMar>
+          </w:tcPr>
+          <w:p>
+            <w:r>
+              <w:rPr>
+                <w:sz w:val="17"/>
+              </w:rPr>
+              <w:t>6</w:t>
+            </w:r>
+          </w:p>
+        </w:tc>
+        <w:tc>
+          <w:tcPr>
+            <w:tcW w:type="dxa" w:w="1584"/>
+            <w:tcMar>
+              <w:top w:w="60" w:type="dxa"/>
+              <w:bottom w:w="60" w:type="dxa"/>
+              <w:left w:w="80" w:type="dxa"/>
+              <w:right w:w="80" w:type="dxa"/>
+            </w:tcMar>
+          </w:tcPr>
+          <w:p>
+            <w:r>
+              <w:rPr>
+                <w:rFonts w:ascii="Consolas" w:hAnsi="Consolas"/>
+                <w:sz w:val="17"/>
+              </w:rPr>
+              <w:t>4a4b6cd</w:t>
+            </w:r>
+          </w:p>
+        </w:tc>
+        <w:tc>
+          <w:tcPr>
+            <w:tcW w:type="dxa" w:w="1440"/>
+            <w:tcMar>
+              <w:top w:w="60" w:type="dxa"/>
+              <w:bottom w:w="60" w:type="dxa"/>
+              <w:left w:w="80" w:type="dxa"/>
+              <w:right w:w="80" w:type="dxa"/>
+            </w:tcMar>
+          </w:tcPr>
+          <w:p>
+            <w:r>
+              <w:rPr>
+                <w:sz w:val="17"/>
+              </w:rPr>
+              <w:t>SK-003</w:t>
+            </w:r>
+          </w:p>
+        </w:tc>
+        <w:tc>
+          <w:tcPr>
+            <w:tcW w:type="dxa" w:w="6480"/>
+            <w:tcMar>
+              <w:top w:w="60" w:type="dxa"/>
+              <w:bottom w:w="60" w:type="dxa"/>
+              <w:left w:w="80" w:type="dxa"/>
+              <w:right w:w="80" w:type="dxa"/>
+            </w:tcMar>
+          </w:tcPr>
+          <w:p>
+            <w:r>
+              <w:rPr>
+                <w:sz w:val="17"/>
+              </w:rPr>
+              <w:t>[KOREKSI] Test regression SK-003 mengimpor production code lib/storage.ts (RED: 4 test gagal)</w:t>
+            </w:r>
+          </w:p>
+        </w:tc>
+      </w:tr>
+      <w:tr>
+        <w:tc>
+          <w:tcPr>
+            <w:tcW w:type="dxa" w:w="576"/>
+            <w:tcMar>
+              <w:top w:w="60" w:type="dxa"/>
+              <w:bottom w:w="60" w:type="dxa"/>
+              <w:left w:w="80" w:type="dxa"/>
+              <w:right w:w="80" w:type="dxa"/>
+            </w:tcMar>
+          </w:tcPr>
+          <w:p>
+            <w:r>
+              <w:rPr>
+                <w:sz w:val="17"/>
+              </w:rPr>
+              <w:t>7</w:t>
+            </w:r>
+          </w:p>
+        </w:tc>
+        <w:tc>
+          <w:tcPr>
+            <w:tcW w:type="dxa" w:w="1584"/>
+            <w:tcMar>
+              <w:top w:w="60" w:type="dxa"/>
+              <w:bottom w:w="60" w:type="dxa"/>
+              <w:left w:w="80" w:type="dxa"/>
+              <w:right w:w="80" w:type="dxa"/>
+            </w:tcMar>
+          </w:tcPr>
+          <w:p>
+            <w:r>
+              <w:rPr>
+                <w:rFonts w:ascii="Consolas" w:hAnsi="Consolas"/>
+                <w:sz w:val="17"/>
+              </w:rPr>
+              <w:t>74d3bbd</w:t>
+            </w:r>
+          </w:p>
+        </w:tc>
+        <w:tc>
+          <w:tcPr>
+            <w:tcW w:type="dxa" w:w="1440"/>
+            <w:tcMar>
+              <w:top w:w="60" w:type="dxa"/>
+              <w:bottom w:w="60" w:type="dxa"/>
+              <w:left w:w="80" w:type="dxa"/>
+              <w:right w:w="80" w:type="dxa"/>
+            </w:tcMar>
+          </w:tcPr>
+          <w:p>
+            <w:r>
+              <w:rPr>
+                <w:sz w:val="17"/>
+              </w:rPr>
+              <w:t>SK-003</w:t>
+            </w:r>
+          </w:p>
+        </w:tc>
+        <w:tc>
+          <w:tcPr>
+            <w:tcW w:type="dxa" w:w="6480"/>
+            <w:tcMar>
+              <w:top w:w="60" w:type="dxa"/>
+              <w:bottom w:w="60" w:type="dxa"/>
+              <w:left w:w="80" w:type="dxa"/>
+              <w:right w:w="80" w:type="dxa"/>
+            </w:tcMar>
+          </w:tcPr>
+          <w:p>
+            <w:r>
+              <w:rPr>
+                <w:sz w:val="17"/>
+              </w:rPr>
+              <w:t>[KOREKSI] Validasi record, blokir mutasi saat corrupt/incompatible, UI StorageRecoveryScreen (GREEN: 18/18 PASS)</w:t>
+            </w:r>
+          </w:p>
+        </w:tc>
+      </w:tr>
+      <w:tr>
+        <w:tc>
+          <w:tcPr>
+            <w:tcW w:type="dxa" w:w="576"/>
+            <w:tcMar>
+              <w:top w:w="60" w:type="dxa"/>
+              <w:bottom w:w="60" w:type="dxa"/>
+              <w:left w:w="80" w:type="dxa"/>
+              <w:right w:w="80" w:type="dxa"/>
+            </w:tcMar>
+          </w:tcPr>
+          <w:p>
+            <w:r>
+              <w:rPr>
+                <w:sz w:val="17"/>
+              </w:rPr>
+              <w:t>8</w:t>
+            </w:r>
+          </w:p>
+        </w:tc>
+        <w:tc>
+          <w:tcPr>
+            <w:tcW w:type="dxa" w:w="1584"/>
+            <w:tcMar>
+              <w:top w:w="60" w:type="dxa"/>
+              <w:bottom w:w="60" w:type="dxa"/>
+              <w:left w:w="80" w:type="dxa"/>
+              <w:right w:w="80" w:type="dxa"/>
+            </w:tcMar>
+          </w:tcPr>
+          <w:p>
+            <w:r>
+              <w:rPr>
+                <w:rFonts w:ascii="Consolas" w:hAnsi="Consolas"/>
+                <w:sz w:val="17"/>
+              </w:rPr>
+              <w:t>1fb7cf9</w:t>
+            </w:r>
+          </w:p>
+        </w:tc>
+        <w:tc>
+          <w:tcPr>
+            <w:tcW w:type="dxa" w:w="1440"/>
+            <w:tcMar>
+              <w:top w:w="60" w:type="dxa"/>
+              <w:bottom w:w="60" w:type="dxa"/>
+              <w:left w:w="80" w:type="dxa"/>
+              <w:right w:w="80" w:type="dxa"/>
+            </w:tcMar>
+          </w:tcPr>
+          <w:p>
+            <w:r>
+              <w:rPr>
+                <w:sz w:val="17"/>
+              </w:rPr>
+              <w:t>SK-004</w:t>
+            </w:r>
+          </w:p>
+        </w:tc>
+        <w:tc>
+          <w:tcPr>
+            <w:tcW w:type="dxa" w:w="6480"/>
+            <w:tcMar>
+              <w:top w:w="60" w:type="dxa"/>
+              <w:bottom w:w="60" w:type="dxa"/>
+              <w:left w:w="80" w:type="dxa"/>
+              <w:right w:w="80" w:type="dxa"/>
+            </w:tcMar>
+          </w:tcPr>
+          <w:p>
+            <w:r>
+              <w:rPr>
+                <w:sz w:val="17"/>
+              </w:rPr>
+              <w:t>[KOREKSI] Test regression SK-004 mengimpor production code lib/data-restore.ts (RED: 8 test gagal)</w:t>
+            </w:r>
+          </w:p>
+        </w:tc>
+      </w:tr>
+      <w:tr>
+        <w:tc>
+          <w:tcPr>
+            <w:tcW w:type="dxa" w:w="576"/>
+            <w:tcMar>
+              <w:top w:w="60" w:type="dxa"/>
+              <w:bottom w:w="60" w:type="dxa"/>
+              <w:left w:w="80" w:type="dxa"/>
+              <w:right w:w="80" w:type="dxa"/>
+            </w:tcMar>
+          </w:tcPr>
+          <w:p>
+            <w:r>
+              <w:rPr>
+                <w:sz w:val="17"/>
+              </w:rPr>
+              <w:t>9</w:t>
+            </w:r>
+          </w:p>
+        </w:tc>
+        <w:tc>
+          <w:tcPr>
+            <w:tcW w:type="dxa" w:w="1584"/>
+            <w:tcMar>
+              <w:top w:w="60" w:type="dxa"/>
+              <w:bottom w:w="60" w:type="dxa"/>
+              <w:left w:w="80" w:type="dxa"/>
+              <w:right w:w="80" w:type="dxa"/>
+            </w:tcMar>
+          </w:tcPr>
+          <w:p>
+            <w:r>
+              <w:rPr>
+                <w:rFonts w:ascii="Consolas" w:hAnsi="Consolas"/>
+                <w:sz w:val="17"/>
+              </w:rPr>
+              <w:t>1e2a0b3</w:t>
+            </w:r>
+          </w:p>
+        </w:tc>
+        <w:tc>
+          <w:tcPr>
+            <w:tcW w:type="dxa" w:w="1440"/>
+            <w:tcMar>
+              <w:top w:w="60" w:type="dxa"/>
+              <w:bottom w:w="60" w:type="dxa"/>
+              <w:left w:w="80" w:type="dxa"/>
+              <w:right w:w="80" w:type="dxa"/>
+            </w:tcMar>
+          </w:tcPr>
+          <w:p>
+            <w:r>
+              <w:rPr>
+                <w:sz w:val="17"/>
+              </w:rPr>
+              <w:t>SK-004</w:t>
+            </w:r>
+          </w:p>
+        </w:tc>
+        <w:tc>
+          <w:tcPr>
+            <w:tcW w:type="dxa" w:w="6480"/>
+            <w:tcMar>
+              <w:top w:w="60" w:type="dxa"/>
+              <w:bottom w:w="60" w:type="dxa"/>
+              <w:left w:w="80" w:type="dxa"/>
+              <w:right w:w="80" w:type="dxa"/>
+            </w:tcMar>
+          </w:tcPr>
+          <w:p>
+            <w:r>
+              <w:rPr>
+                <w:sz w:val="17"/>
+              </w:rPr>
+              <w:t>[KOREKSI] Validasi skema, multi-key checkpoint (primary+goals), konfirmasi replace, atomic rollback UI (GREEN: 16/16 PASS)</w:t>
+            </w:r>
+          </w:p>
+        </w:tc>
+      </w:tr>
+      <w:tr>
+        <w:tc>
+          <w:tcPr>
+            <w:tcW w:type="dxa" w:w="576"/>
+            <w:tcMar>
+              <w:top w:w="60" w:type="dxa"/>
+              <w:bottom w:w="60" w:type="dxa"/>
+              <w:left w:w="80" w:type="dxa"/>
+              <w:right w:w="80" w:type="dxa"/>
+            </w:tcMar>
+          </w:tcPr>
+          <w:p>
+            <w:r>
+              <w:rPr>
+                <w:sz w:val="17"/>
+              </w:rPr>
+              <w:t>10</w:t>
+            </w:r>
+          </w:p>
+        </w:tc>
+        <w:tc>
+          <w:tcPr>
+            <w:tcW w:type="dxa" w:w="1584"/>
+            <w:tcMar>
+              <w:top w:w="60" w:type="dxa"/>
+              <w:bottom w:w="60" w:type="dxa"/>
+              <w:left w:w="80" w:type="dxa"/>
+              <w:right w:w="80" w:type="dxa"/>
+            </w:tcMar>
+          </w:tcPr>
+          <w:p>
+            <w:r>
+              <w:rPr>
+                <w:rFonts w:ascii="Consolas" w:hAnsi="Consolas"/>
+                <w:sz w:val="17"/>
+              </w:rPr>
+              <w:t>1450a10</w:t>
+            </w:r>
+          </w:p>
+        </w:tc>
+        <w:tc>
+          <w:tcPr>
+            <w:tcW w:type="dxa" w:w="1440"/>
+            <w:tcMar>
+              <w:top w:w="60" w:type="dxa"/>
+              <w:bottom w:w="60" w:type="dxa"/>
+              <w:left w:w="80" w:type="dxa"/>
+              <w:right w:w="80" w:type="dxa"/>
+            </w:tcMar>
+          </w:tcPr>
+          <w:p>
+            <w:r>
+              <w:rPr>
+                <w:sz w:val="17"/>
+              </w:rPr>
+              <w:t>SK-001</w:t>
+            </w:r>
+          </w:p>
+        </w:tc>
+        <w:tc>
+          <w:tcPr>
+            <w:tcW w:type="dxa" w:w="6480"/>
+            <w:tcMar>
+              <w:top w:w="60" w:type="dxa"/>
+              <w:bottom w:w="60" w:type="dxa"/>
+              <w:left w:w="80" w:type="dxa"/>
+              <w:right w:w="80" w:type="dxa"/>
+            </w:tcMar>
+          </w:tcPr>
+          <w:p>
+            <w:r>
+              <w:rPr>
+                <w:sz w:val="17"/>
+              </w:rPr>
+              <w:t>[KOREKSI] Hubungkan scanner data personal ke pnpm test via scripts/run-all-tests.mjs secara jujur</w:t>
+            </w:r>
+          </w:p>
+        </w:tc>
+      </w:tr>
+      <w:tr>
+        <w:tc>
+          <w:tcPr>
+            <w:tcW w:type="dxa" w:w="576"/>
+            <w:tcMar>
+              <w:top w:w="60" w:type="dxa"/>
+              <w:bottom w:w="60" w:type="dxa"/>
+              <w:left w:w="80" w:type="dxa"/>
+              <w:right w:w="80" w:type="dxa"/>
+            </w:tcMar>
+          </w:tcPr>
+          <w:p>
+            <w:r>
+              <w:rPr>
+                <w:sz w:val="17"/>
+              </w:rPr>
+              <w:t>11</w:t>
+            </w:r>
+          </w:p>
+        </w:tc>
+        <w:tc>
+          <w:tcPr>
+            <w:tcW w:type="dxa" w:w="1584"/>
+            <w:tcMar>
+              <w:top w:w="60" w:type="dxa"/>
+              <w:bottom w:w="60" w:type="dxa"/>
+              <w:left w:w="80" w:type="dxa"/>
+              <w:right w:w="80" w:type="dxa"/>
+            </w:tcMar>
+          </w:tcPr>
+          <w:p>
+            <w:r>
+              <w:rPr>
+                <w:rFonts w:ascii="Consolas" w:hAnsi="Consolas"/>
+                <w:sz w:val="17"/>
+              </w:rPr>
+              <w:t>e2b0308</w:t>
+            </w:r>
+          </w:p>
+        </w:tc>
+        <w:tc>
+          <w:tcPr>
+            <w:tcW w:type="dxa" w:w="1440"/>
+            <w:tcMar>
+              <w:top w:w="60" w:type="dxa"/>
+              <w:bottom w:w="60" w:type="dxa"/>
+              <w:left w:w="80" w:type="dxa"/>
+              <w:right w:w="80" w:type="dxa"/>
+            </w:tcMar>
+          </w:tcPr>
+          <w:p>
+            <w:r>
+              <w:rPr>
+                <w:sz w:val="17"/>
+              </w:rPr>
+              <w:t>Docs</w:t>
+            </w:r>
+          </w:p>
+        </w:tc>
+        <w:tc>
+          <w:tcPr>
+            <w:tcW w:type="dxa" w:w="6480"/>
+            <w:tcMar>
+              <w:top w:w="60" w:type="dxa"/>
+              <w:bottom w:w="60" w:type="dxa"/>
+              <w:left w:w="80" w:type="dxa"/>
+              <w:right w:w="80" w:type="dxa"/>
+            </w:tcMar>
+          </w:tcPr>
+          <w:p>
+            <w:r>
+              <w:rPr>
+                <w:sz w:val="17"/>
+              </w:rPr>
+              <w:t>[KOREKSI] Laporan Phase 0 korektif resmi di folder docs repository</w:t>
+            </w:r>
+          </w:p>
+        </w:tc>
+      </w:tr>
+      <w:tr>
+        <w:tc>
+          <w:tcPr>
+            <w:tcW w:type="dxa" w:w="576"/>
+            <w:tcMar>
+              <w:top w:w="60" w:type="dxa"/>
+              <w:bottom w:w="60" w:type="dxa"/>
+              <w:left w:w="80" w:type="dxa"/>
+              <w:right w:w="80" w:type="dxa"/>
+            </w:tcMar>
+          </w:tcPr>
+          <w:p>
+            <w:r>
+              <w:rPr>
+                <w:sz w:val="17"/>
+              </w:rPr>
+              <w:t>12</w:t>
+            </w:r>
+          </w:p>
+        </w:tc>
+        <w:tc>
+          <w:tcPr>
+            <w:tcW w:type="dxa" w:w="1584"/>
+            <w:tcMar>
+              <w:top w:w="60" w:type="dxa"/>
+              <w:bottom w:w="60" w:type="dxa"/>
+              <w:left w:w="80" w:type="dxa"/>
+              <w:right w:w="80" w:type="dxa"/>
+            </w:tcMar>
+          </w:tcPr>
+          <w:p>
+            <w:r>
+              <w:rPr>
+                <w:rFonts w:ascii="Consolas" w:hAnsi="Consolas"/>
+                <w:sz w:val="17"/>
+              </w:rPr>
+              <w:t>51aee27</w:t>
+            </w:r>
+          </w:p>
+        </w:tc>
+        <w:tc>
+          <w:tcPr>
+            <w:tcW w:type="dxa" w:w="1440"/>
+            <w:tcMar>
+              <w:top w:w="60" w:type="dxa"/>
+              <w:bottom w:w="60" w:type="dxa"/>
+              <w:left w:w="80" w:type="dxa"/>
+              <w:right w:w="80" w:type="dxa"/>
+            </w:tcMar>
+          </w:tcPr>
+          <w:p>
+            <w:r>
+              <w:rPr>
+                <w:sz w:val="17"/>
+              </w:rPr>
+              <w:t>Docs</w:t>
+            </w:r>
+          </w:p>
+        </w:tc>
+        <w:tc>
+          <w:tcPr>
+            <w:tcW w:type="dxa" w:w="6480"/>
+            <w:tcMar>
+              <w:top w:w="60" w:type="dxa"/>
+              <w:bottom w:w="60" w:type="dxa"/>
+              <w:left w:w="80" w:type="dxa"/>
+              <w:right w:w="80" w:type="dxa"/>
+            </w:tcMar>
+          </w:tcPr>
+          <w:p>
+            <w:r>
+              <w:rPr>
+                <w:sz w:val="17"/>
+              </w:rPr>
+              <w:t>Laporan Microsoft Word (.docx) pertama untuk review owner</w:t>
+            </w:r>
+          </w:p>
+        </w:tc>
+      </w:tr>
+      <w:tr>
+        <w:tc>
+          <w:tcPr>
+            <w:tcW w:type="dxa" w:w="576"/>
+            <w:tcMar>
+              <w:top w:w="60" w:type="dxa"/>
+              <w:bottom w:w="60" w:type="dxa"/>
+              <w:left w:w="80" w:type="dxa"/>
+              <w:right w:w="80" w:type="dxa"/>
+            </w:tcMar>
+          </w:tcPr>
+          <w:p>
+            <w:r>
+              <w:rPr>
+                <w:sz w:val="17"/>
+              </w:rPr>
+              <w:t>13</w:t>
+            </w:r>
+          </w:p>
+        </w:tc>
+        <w:tc>
+          <w:tcPr>
+            <w:tcW w:type="dxa" w:w="1584"/>
+            <w:tcMar>
+              <w:top w:w="60" w:type="dxa"/>
+              <w:bottom w:w="60" w:type="dxa"/>
+              <w:left w:w="80" w:type="dxa"/>
+              <w:right w:w="80" w:type="dxa"/>
+            </w:tcMar>
+          </w:tcPr>
+          <w:p>
+            <w:r>
+              <w:rPr>
+                <w:rFonts w:ascii="Consolas" w:hAnsi="Consolas"/>
+                <w:sz w:val="17"/>
+              </w:rPr>
+              <w:t>20d340a</w:t>
+            </w:r>
+          </w:p>
+        </w:tc>
+        <w:tc>
+          <w:tcPr>
+            <w:tcW w:type="dxa" w:w="1440"/>
+            <w:tcMar>
+              <w:top w:w="60" w:type="dxa"/>
+              <w:bottom w:w="60" w:type="dxa"/>
+              <w:left w:w="80" w:type="dxa"/>
+              <w:right w:w="80" w:type="dxa"/>
+            </w:tcMar>
+          </w:tcPr>
+          <w:p>
+            <w:r>
+              <w:rPr>
+                <w:sz w:val="17"/>
+              </w:rPr>
+              <w:t>Docs</w:t>
+            </w:r>
+          </w:p>
+        </w:tc>
+        <w:tc>
+          <w:tcPr>
+            <w:tcW w:type="dxa" w:w="6480"/>
+            <w:tcMar>
+              <w:top w:w="60" w:type="dxa"/>
+              <w:bottom w:w="60" w:type="dxa"/>
+              <w:left w:w="80" w:type="dxa"/>
+              <w:right w:w="80" w:type="dxa"/>
+            </w:tcMar>
+          </w:tcPr>
+          <w:p>
+            <w:r>
+              <w:rPr>
+                <w:sz w:val="17"/>
+              </w:rPr>
+              <w:t>Sinkronisasi commit count &amp; HEAD hash ke dokumen laporan</w:t>
+            </w:r>
+          </w:p>
+        </w:tc>
+      </w:tr>
+      <w:tr>
+        <w:tc>
+          <w:tcPr>
+            <w:tcW w:type="dxa" w:w="576"/>
+            <w:tcMar>
+              <w:top w:w="60" w:type="dxa"/>
+              <w:bottom w:w="60" w:type="dxa"/>
+              <w:left w:w="80" w:type="dxa"/>
+              <w:right w:w="80" w:type="dxa"/>
+            </w:tcMar>
+          </w:tcPr>
+          <w:p>
+            <w:r>
+              <w:rPr>
+                <w:sz w:val="17"/>
+              </w:rPr>
+              <w:t>14</w:t>
+            </w:r>
+          </w:p>
+        </w:tc>
+        <w:tc>
+          <w:tcPr>
+            <w:tcW w:type="dxa" w:w="1584"/>
+            <w:tcMar>
+              <w:top w:w="60" w:type="dxa"/>
+              <w:bottom w:w="60" w:type="dxa"/>
+              <w:left w:w="80" w:type="dxa"/>
+              <w:right w:w="80" w:type="dxa"/>
+            </w:tcMar>
+          </w:tcPr>
+          <w:p>
+            <w:r>
+              <w:rPr>
+                <w:rFonts w:ascii="Consolas" w:hAnsi="Consolas"/>
+                <w:sz w:val="17"/>
+              </w:rPr>
+              <w:t>f689225</w:t>
+            </w:r>
+          </w:p>
+        </w:tc>
+        <w:tc>
+          <w:tcPr>
+            <w:tcW w:type="dxa" w:w="1440"/>
+            <w:tcMar>
+              <w:top w:w="60" w:type="dxa"/>
+              <w:bottom w:w="60" w:type="dxa"/>
+              <w:left w:w="80" w:type="dxa"/>
+              <w:right w:w="80" w:type="dxa"/>
+            </w:tcMar>
+          </w:tcPr>
+          <w:p>
+            <w:r>
+              <w:rPr>
+                <w:sz w:val="17"/>
+              </w:rPr>
+              <w:t>Docs</w:t>
+            </w:r>
+          </w:p>
+        </w:tc>
+        <w:tc>
+          <w:tcPr>
+            <w:tcW w:type="dxa" w:w="6480"/>
+            <w:tcMar>
+              <w:top w:w="60" w:type="dxa"/>
+              <w:bottom w:w="60" w:type="dxa"/>
+              <w:left w:w="80" w:type="dxa"/>
+              <w:right w:w="80" w:type="dxa"/>
+            </w:tcMar>
+          </w:tcPr>
+          <w:p>
+            <w:r>
+              <w:rPr>
+                <w:sz w:val="17"/>
+              </w:rPr>
+              <w:t>Finalisasi deliverable laporan Word (.docx) lengkap</w:t>
             </w:r>
           </w:p>
         </w:tc>
@@ -224,46 +1484,290 @@
         <w:pStyle w:val="Heading1"/>
       </w:pPr>
       <w:r>
-        <w:t>2. Verifikasi Aktual</w:t>
+        <w:rPr>
+          <w:color w:val="0F2A4A"/>
+        </w:rPr>
+        <w:t>2. Detail Evaluasi &amp; Perbaikan per Finding</w:t>
+      </w:r>
+    </w:p>
+    <w:p>
+      <w:pPr>
+        <w:pStyle w:val="Heading2"/>
+      </w:pPr>
+      <w:r>
+        <w:t>2.1 SK-001: Data Exposure Containment</w:t>
+      </w:r>
+    </w:p>
+    <w:p>
+      <w:r>
+        <w:rPr>
+          <w:b/>
+        </w:rPr>
+        <w:t xml:space="preserve">Status: </w:t>
+      </w:r>
+      <w:r>
+        <w:t>Local HEAD Containment Selesai. Remote HEAD &amp; History Purge Menunggu Persetujuan Owner.</w:t>
+        <w:br/>
+      </w:r>
+      <w:r>
+        <w:rPr>
+          <w:b/>
+        </w:rPr>
+        <w:t xml:space="preserve">• Local Containment: </w:t>
+      </w:r>
+      <w:r>
+        <w:t>File preloaded-state.json (424KB, 1.437 transaksi) telah dihapus dari repositori lokal sejak commit b8bf646. Aturan .gitignore telah ditambahkan.</w:t>
+        <w:br/>
+      </w:r>
+      <w:r>
+        <w:rPr>
+          <w:b/>
+        </w:rPr>
+        <w:t xml:space="preserve">• Integrasi Gate: </w:t>
+      </w:r>
+      <w:r>
+        <w:t>scripts/scan-personal-data.mjs kini otomatis dijalankan setiap pnpm test.</w:t>
+        <w:br/>
+      </w:r>
+      <w:r>
+        <w:rPr>
+          <w:b/>
+        </w:rPr>
+        <w:t xml:space="preserve">• Batasan Scanner: </w:t>
+      </w:r>
+      <w:r>
+        <w:t>Scanner memverifikasi kebersihan working tree dan tracked files lokal. Scanner bukan history scanner dan bukan PII scanner universal.</w:t>
+        <w:br/>
+      </w:r>
+    </w:p>
+    <w:p>
+      <w:pPr>
+        <w:pStyle w:val="Heading2"/>
+      </w:pPr>
+      <w:r>
+        <w:t>2.2 SK-003: Storage Corruption &amp; Mode Kehilangan Data</w:t>
+      </w:r>
+    </w:p>
+    <w:p>
+      <w:r>
+        <w:rPr>
+          <w:b/>
+        </w:rPr>
+        <w:t xml:space="preserve">Status: </w:t>
+      </w:r>
+      <w:r>
+        <w:t>Fixed + Validated Langsung pada Production Code (18/18 PASS).</w:t>
+        <w:br/>
+      </w:r>
+      <w:r>
+        <w:rPr>
+          <w:b/>
+        </w:rPr>
+        <w:t xml:space="preserve">• Ekstraksi Helper Produksi: </w:t>
+      </w:r>
+      <w:r>
+        <w:t>Logika storage dipusatkan di lib/storage.ts. StoreProvider dan script test mengimpor file produksi yang sama.</w:t>
+        <w:br/>
+      </w:r>
+      <w:r>
+        <w:rPr>
+          <w:b/>
+        </w:rPr>
+        <w:t xml:space="preserve">• Validasi Record: </w:t>
+      </w:r>
+      <w:r>
+        <w:t>Menolak JSON array ([]), primitif, dan tipe field transactions/wallets yang salah.</w:t>
+        <w:br/>
+      </w:r>
+      <w:r>
+        <w:rPr>
+          <w:b/>
+        </w:rPr>
+        <w:t xml:space="preserve">• Pemblokiran Mutasi: </w:t>
+      </w:r>
+      <w:r>
+        <w:t>canMutateState memblokir seluruh add/edit/delete/transfer saat status corrupt/incompatible, mencegah silent data loss.</w:t>
+        <w:br/>
+      </w:r>
+      <w:r>
+        <w:rPr>
+          <w:b/>
+        </w:rPr>
+        <w:t xml:space="preserve">• Layar Pemulihan: </w:t>
+      </w:r>
+      <w:r>
+        <w:t>components/storage-recovery-screen.tsx menyediakan fitur salin payload, unduh JSON recovery, dan reset terkonfirmasi.</w:t>
+        <w:br/>
+      </w:r>
+    </w:p>
+    <w:p>
+      <w:pPr>
+        <w:pStyle w:val="Heading2"/>
+      </w:pPr>
+      <w:r>
+        <w:t>2.3 SK-004: Transactional Restore &amp; Multi-Key Rollback</w:t>
+      </w:r>
+    </w:p>
+    <w:p>
+      <w:r>
+        <w:rPr>
+          <w:b/>
+        </w:rPr>
+        <w:t xml:space="preserve">Status: </w:t>
+      </w:r>
+      <w:r>
+        <w:t>Fixed + Validated Langsung pada Production Code (16/16 PASS).</w:t>
+        <w:br/>
+      </w:r>
+      <w:r>
+        <w:rPr>
+          <w:b/>
+        </w:rPr>
+        <w:t xml:space="preserve">• Helper Impor Produksi: </w:t>
+      </w:r>
+      <w:r>
+        <w:t>lib/data-restore.ts menyediakan planImport, executeImportTransaction, executeRollback, dan canRollback.</w:t>
+        <w:br/>
+      </w:r>
+      <w:r>
+        <w:rPr>
+          <w:b/>
+        </w:rPr>
+        <w:t xml:space="preserve">• Validasi Ketat: </w:t>
+      </w:r>
+      <w:r>
+        <w:t>Menolak file backup yang memuat baris transaksi invalid, tanggal cacat, amount &lt;= 0, atau duplicate ID.</w:t>
+        <w:br/>
+      </w:r>
+      <w:r>
+        <w:rPr>
+          <w:b/>
+        </w:rPr>
+        <w:t xml:space="preserve">• Multi-Key Checkpoint: </w:t>
+      </w:r>
+      <w:r>
+        <w:t>Menyimpan STORAGE_KEY dan GOAL_STORAGE_KEY secara bersamaan. Kegagalan penulisan goals memicu full rollback otomatis.</w:t>
+        <w:br/>
+      </w:r>
+      <w:r>
+        <w:rPr>
+          <w:b/>
+        </w:rPr>
+        <w:t xml:space="preserve">• Preview &amp; Rollback UI: </w:t>
+      </w:r>
+      <w:r>
+        <w:t>Modal pratinjau di components/data-portability.tsx menampilkan perbandingan data sebelum replace. Tombol rollback siap pakai.</w:t>
+        <w:br/>
+      </w:r>
+    </w:p>
+    <w:p>
+      <w:pPr>
+        <w:pStyle w:val="Heading1"/>
+      </w:pPr>
+      <w:r>
+        <w:rPr>
+          <w:color w:val="0F2A4A"/>
+        </w:rPr>
+        <w:t>3. Hasil Verifikasi Aktual</w:t>
       </w:r>
     </w:p>
     <w:tbl>
       <w:tblPr>
         <w:tblW w:type="auto" w:w="0"/>
+        <w:jc w:val="center"/>
         <w:tblLook w:firstColumn="1" w:firstRow="1" w:lastColumn="0" w:lastRow="0" w:noHBand="0" w:noVBand="1" w:val="04A0"/>
       </w:tblPr>
       <w:tblGrid>
-        <w:gridCol w:w="2880"/>
-        <w:gridCol w:w="2880"/>
-        <w:gridCol w:w="2880"/>
+        <w:gridCol w:w="2484"/>
+        <w:gridCol w:w="2484"/>
+        <w:gridCol w:w="2484"/>
+        <w:gridCol w:w="2484"/>
       </w:tblGrid>
       <w:tr>
         <w:tc>
           <w:tcPr>
-            <w:tcW w:type="dxa" w:w="2880"/>
+            <w:tcW w:type="dxa" w:w="2160"/>
+            <w:shd w:fill="0F2A4A"/>
+            <w:tcMar>
+              <w:top w:w="80" w:type="dxa"/>
+              <w:bottom w:w="80" w:type="dxa"/>
+              <w:left w:w="100" w:type="dxa"/>
+              <w:right w:w="100" w:type="dxa"/>
+            </w:tcMar>
           </w:tcPr>
           <w:p>
             <w:r>
+              <w:rPr>
+                <w:b/>
+                <w:color w:val="FFFFFF"/>
+                <w:sz w:val="18"/>
+              </w:rPr>
               <w:t>Pemeriksaan</w:t>
             </w:r>
           </w:p>
         </w:tc>
         <w:tc>
           <w:tcPr>
-            <w:tcW w:type="dxa" w:w="2880"/>
+            <w:tcW w:type="dxa" w:w="3168"/>
+            <w:shd w:fill="0F2A4A"/>
+            <w:tcMar>
+              <w:top w:w="80" w:type="dxa"/>
+              <w:bottom w:w="80" w:type="dxa"/>
+              <w:left w:w="100" w:type="dxa"/>
+              <w:right w:w="100" w:type="dxa"/>
+            </w:tcMar>
           </w:tcPr>
           <w:p>
             <w:r>
+              <w:rPr>
+                <w:b/>
+                <w:color w:val="FFFFFF"/>
+                <w:sz w:val="18"/>
+              </w:rPr>
+              <w:t>Perintah</w:t>
+            </w:r>
+          </w:p>
+        </w:tc>
+        <w:tc>
+          <w:tcPr>
+            <w:tcW w:type="dxa" w:w="1440"/>
+            <w:shd w:fill="0F2A4A"/>
+            <w:tcMar>
+              <w:top w:w="80" w:type="dxa"/>
+              <w:bottom w:w="80" w:type="dxa"/>
+              <w:left w:w="100" w:type="dxa"/>
+              <w:right w:w="100" w:type="dxa"/>
+            </w:tcMar>
+          </w:tcPr>
+          <w:p>
+            <w:r>
+              <w:rPr>
+                <w:b/>
+                <w:color w:val="FFFFFF"/>
+                <w:sz w:val="18"/>
+              </w:rPr>
               <w:t>Hasil</w:t>
             </w:r>
           </w:p>
         </w:tc>
         <w:tc>
           <w:tcPr>
-            <w:tcW w:type="dxa" w:w="2880"/>
+            <w:tcW w:type="dxa" w:w="3312"/>
+            <w:shd w:fill="0F2A4A"/>
+            <w:tcMar>
+              <w:top w:w="80" w:type="dxa"/>
+              <w:bottom w:w="80" w:type="dxa"/>
+              <w:left w:w="100" w:type="dxa"/>
+              <w:right w:w="100" w:type="dxa"/>
+            </w:tcMar>
           </w:tcPr>
           <w:p>
             <w:r>
+              <w:rPr>
+                <w:b/>
+                <w:color w:val="FFFFFF"/>
+                <w:sz w:val="18"/>
+              </w:rPr>
               <w:t>Keterangan</w:t>
             </w:r>
           </w:p>
@@ -272,31 +1776,79 @@
       <w:tr>
         <w:tc>
           <w:tcPr>
-            <w:tcW w:type="dxa" w:w="2880"/>
+            <w:tcW w:type="dxa" w:w="2160"/>
+            <w:tcMar>
+              <w:top w:w="60" w:type="dxa"/>
+              <w:bottom w:w="60" w:type="dxa"/>
+              <w:left w:w="80" w:type="dxa"/>
+              <w:right w:w="80" w:type="dxa"/>
+            </w:tcMar>
           </w:tcPr>
           <w:p>
             <w:r>
+              <w:rPr>
+                <w:sz w:val="17"/>
+              </w:rPr>
+              <w:t>Unified Gate</w:t>
+            </w:r>
+          </w:p>
+        </w:tc>
+        <w:tc>
+          <w:tcPr>
+            <w:tcW w:type="dxa" w:w="3168"/>
+            <w:tcMar>
+              <w:top w:w="60" w:type="dxa"/>
+              <w:bottom w:w="60" w:type="dxa"/>
+              <w:left w:w="80" w:type="dxa"/>
+              <w:right w:w="80" w:type="dxa"/>
+            </w:tcMar>
+          </w:tcPr>
+          <w:p>
+            <w:r>
+              <w:rPr>
+                <w:sz w:val="17"/>
+              </w:rPr>
               <w:t>pnpm test</w:t>
             </w:r>
           </w:p>
         </w:tc>
         <w:tc>
           <w:tcPr>
-            <w:tcW w:type="dxa" w:w="2880"/>
+            <w:tcW w:type="dxa" w:w="1440"/>
+            <w:tcMar>
+              <w:top w:w="60" w:type="dxa"/>
+              <w:bottom w:w="60" w:type="dxa"/>
+              <w:left w:w="80" w:type="dxa"/>
+              <w:right w:w="80" w:type="dxa"/>
+            </w:tcMar>
           </w:tcPr>
           <w:p>
             <w:r>
-              <w:t>PASS (34 Regr + 3 Scan)</w:t>
+              <w:rPr>
+                <w:b/>
+                <w:color w:val="0A6644"/>
+                <w:sz w:val="17"/>
+              </w:rPr>
+              <w:t>PASS</w:t>
             </w:r>
           </w:p>
         </w:tc>
         <w:tc>
           <w:tcPr>
-            <w:tcW w:type="dxa" w:w="2880"/>
+            <w:tcW w:type="dxa" w:w="3312"/>
+            <w:tcMar>
+              <w:top w:w="60" w:type="dxa"/>
+              <w:bottom w:w="60" w:type="dxa"/>
+              <w:left w:w="80" w:type="dxa"/>
+              <w:right w:w="80" w:type="dxa"/>
+            </w:tcMar>
           </w:tcPr>
           <w:p>
             <w:r>
-              <w:t>34 regression tests + 3 scanner security checks</w:t>
+              <w:rPr>
+                <w:sz w:val="17"/>
+              </w:rPr>
+              <w:t>34 regression tests + 3 scanner checks lulus</w:t>
             </w:r>
           </w:p>
         </w:tc>
@@ -304,31 +1856,79 @@
       <w:tr>
         <w:tc>
           <w:tcPr>
-            <w:tcW w:type="dxa" w:w="2880"/>
+            <w:tcW w:type="dxa" w:w="2160"/>
+            <w:tcMar>
+              <w:top w:w="60" w:type="dxa"/>
+              <w:bottom w:w="60" w:type="dxa"/>
+              <w:left w:w="80" w:type="dxa"/>
+              <w:right w:w="80" w:type="dxa"/>
+            </w:tcMar>
           </w:tcPr>
           <w:p>
             <w:r>
-              <w:t>TypeScript (tsc)</w:t>
+              <w:rPr>
+                <w:sz w:val="17"/>
+              </w:rPr>
+              <w:t>Budget Logic</w:t>
             </w:r>
           </w:p>
         </w:tc>
         <w:tc>
           <w:tcPr>
-            <w:tcW w:type="dxa" w:w="2880"/>
+            <w:tcW w:type="dxa" w:w="3168"/>
+            <w:tcMar>
+              <w:top w:w="60" w:type="dxa"/>
+              <w:bottom w:w="60" w:type="dxa"/>
+              <w:left w:w="80" w:type="dxa"/>
+              <w:right w:w="80" w:type="dxa"/>
+            </w:tcMar>
           </w:tcPr>
           <w:p>
             <w:r>
-              <w:t>PASS</w:t>
+              <w:rPr>
+                <w:sz w:val="17"/>
+              </w:rPr>
+              <w:t>node scripts/test-budget-logic.mjs</w:t>
             </w:r>
           </w:p>
         </w:tc>
         <w:tc>
           <w:tcPr>
-            <w:tcW w:type="dxa" w:w="2880"/>
+            <w:tcW w:type="dxa" w:w="1440"/>
+            <w:tcMar>
+              <w:top w:w="60" w:type="dxa"/>
+              <w:bottom w:w="60" w:type="dxa"/>
+              <w:left w:w="80" w:type="dxa"/>
+              <w:right w:w="80" w:type="dxa"/>
+            </w:tcMar>
           </w:tcPr>
           <w:p>
             <w:r>
-              <w:t>0 type error</w:t>
+              <w:rPr>
+                <w:b/>
+                <w:color w:val="0A6644"/>
+                <w:sz w:val="17"/>
+              </w:rPr>
+              <w:t>7/7 PASS</w:t>
+            </w:r>
+          </w:p>
+        </w:tc>
+        <w:tc>
+          <w:tcPr>
+            <w:tcW w:type="dxa" w:w="3312"/>
+            <w:tcMar>
+              <w:top w:w="60" w:type="dxa"/>
+              <w:bottom w:w="60" w:type="dxa"/>
+              <w:left w:w="80" w:type="dxa"/>
+              <w:right w:w="80" w:type="dxa"/>
+            </w:tcMar>
+          </w:tcPr>
+          <w:p>
+            <w:r>
+              <w:rPr>
+                <w:sz w:val="17"/>
+              </w:rPr>
+              <w:t>Hierarki budget &amp; batas 31-hari aman</w:t>
             </w:r>
           </w:p>
         </w:tc>
@@ -336,31 +1936,79 @@
       <w:tr>
         <w:tc>
           <w:tcPr>
-            <w:tcW w:type="dxa" w:w="2880"/>
+            <w:tcW w:type="dxa" w:w="2160"/>
+            <w:tcMar>
+              <w:top w:w="60" w:type="dxa"/>
+              <w:bottom w:w="60" w:type="dxa"/>
+              <w:left w:w="80" w:type="dxa"/>
+              <w:right w:w="80" w:type="dxa"/>
+            </w:tcMar>
           </w:tcPr>
           <w:p>
             <w:r>
-              <w:t>Web Build (Turbopack)</w:t>
+              <w:rPr>
+                <w:sz w:val="17"/>
+              </w:rPr>
+              <w:t>SK-003 Storage</w:t>
             </w:r>
           </w:p>
         </w:tc>
         <w:tc>
           <w:tcPr>
-            <w:tcW w:type="dxa" w:w="2880"/>
+            <w:tcW w:type="dxa" w:w="3168"/>
+            <w:tcMar>
+              <w:top w:w="60" w:type="dxa"/>
+              <w:bottom w:w="60" w:type="dxa"/>
+              <w:left w:w="80" w:type="dxa"/>
+              <w:right w:w="80" w:type="dxa"/>
+            </w:tcMar>
           </w:tcPr>
           <w:p>
             <w:r>
-              <w:t>PASS</w:t>
+              <w:rPr>
+                <w:sz w:val="17"/>
+              </w:rPr>
+              <w:t>node scripts/test-storage-corruption.mjs</w:t>
             </w:r>
           </w:p>
         </w:tc>
         <w:tc>
           <w:tcPr>
-            <w:tcW w:type="dxa" w:w="2880"/>
+            <w:tcW w:type="dxa" w:w="1440"/>
+            <w:tcMar>
+              <w:top w:w="60" w:type="dxa"/>
+              <w:bottom w:w="60" w:type="dxa"/>
+              <w:left w:w="80" w:type="dxa"/>
+              <w:right w:w="80" w:type="dxa"/>
+            </w:tcMar>
           </w:tcPr>
           <w:p>
             <w:r>
-              <w:t>Next.js production build sukses</w:t>
+              <w:rPr>
+                <w:b/>
+                <w:color w:val="0A6644"/>
+                <w:sz w:val="17"/>
+              </w:rPr>
+              <w:t>18/18 PASS</w:t>
+            </w:r>
+          </w:p>
+        </w:tc>
+        <w:tc>
+          <w:tcPr>
+            <w:tcW w:type="dxa" w:w="3312"/>
+            <w:tcMar>
+              <w:top w:w="60" w:type="dxa"/>
+              <w:bottom w:w="60" w:type="dxa"/>
+              <w:left w:w="80" w:type="dxa"/>
+              <w:right w:w="80" w:type="dxa"/>
+            </w:tcMar>
+          </w:tcPr>
+          <w:p>
+            <w:r>
+              <w:rPr>
+                <w:sz w:val="17"/>
+              </w:rPr>
+              <w:t>Diuji langsung terhadap lib/storage.ts</w:t>
             </w:r>
           </w:p>
         </w:tc>
@@ -368,31 +2016,79 @@
       <w:tr>
         <w:tc>
           <w:tcPr>
-            <w:tcW w:type="dxa" w:w="2880"/>
+            <w:tcW w:type="dxa" w:w="2160"/>
+            <w:tcMar>
+              <w:top w:w="60" w:type="dxa"/>
+              <w:bottom w:w="60" w:type="dxa"/>
+              <w:left w:w="80" w:type="dxa"/>
+              <w:right w:w="80" w:type="dxa"/>
+            </w:tcMar>
           </w:tcPr>
           <w:p>
             <w:r>
-              <w:t>Mobile Export</w:t>
+              <w:rPr>
+                <w:sz w:val="17"/>
+              </w:rPr>
+              <w:t>SK-004 Restore</w:t>
             </w:r>
           </w:p>
         </w:tc>
         <w:tc>
           <w:tcPr>
-            <w:tcW w:type="dxa" w:w="2880"/>
+            <w:tcW w:type="dxa" w:w="3168"/>
+            <w:tcMar>
+              <w:top w:w="60" w:type="dxa"/>
+              <w:bottom w:w="60" w:type="dxa"/>
+              <w:left w:w="80" w:type="dxa"/>
+              <w:right w:w="80" w:type="dxa"/>
+            </w:tcMar>
           </w:tcPr>
           <w:p>
             <w:r>
-              <w:t>PASS</w:t>
+              <w:rPr>
+                <w:sz w:val="17"/>
+              </w:rPr>
+              <w:t>node scripts/test-import-restore.mjs</w:t>
             </w:r>
           </w:p>
         </w:tc>
         <w:tc>
           <w:tcPr>
-            <w:tcW w:type="dxa" w:w="2880"/>
+            <w:tcW w:type="dxa" w:w="1440"/>
+            <w:tcMar>
+              <w:top w:w="60" w:type="dxa"/>
+              <w:bottom w:w="60" w:type="dxa"/>
+              <w:left w:w="80" w:type="dxa"/>
+              <w:right w:w="80" w:type="dxa"/>
+            </w:tcMar>
           </w:tcPr>
           <w:p>
             <w:r>
-              <w:t>Static export out/ sukses</w:t>
+              <w:rPr>
+                <w:b/>
+                <w:color w:val="0A6644"/>
+                <w:sz w:val="17"/>
+              </w:rPr>
+              <w:t>16/16 PASS</w:t>
+            </w:r>
+          </w:p>
+        </w:tc>
+        <w:tc>
+          <w:tcPr>
+            <w:tcW w:type="dxa" w:w="3312"/>
+            <w:tcMar>
+              <w:top w:w="60" w:type="dxa"/>
+              <w:bottom w:w="60" w:type="dxa"/>
+              <w:left w:w="80" w:type="dxa"/>
+              <w:right w:w="80" w:type="dxa"/>
+            </w:tcMar>
+          </w:tcPr>
+          <w:p>
+            <w:r>
+              <w:rPr>
+                <w:sz w:val="17"/>
+              </w:rPr>
+              <w:t>Diuji langsung terhadap lib/data-restore.ts</w:t>
             </w:r>
           </w:p>
         </w:tc>
@@ -400,31 +2096,558 @@
       <w:tr>
         <w:tc>
           <w:tcPr>
-            <w:tcW w:type="dxa" w:w="2880"/>
+            <w:tcW w:type="dxa" w:w="2160"/>
+            <w:tcMar>
+              <w:top w:w="60" w:type="dxa"/>
+              <w:bottom w:w="60" w:type="dxa"/>
+              <w:left w:w="80" w:type="dxa"/>
+              <w:right w:w="80" w:type="dxa"/>
+            </w:tcMar>
           </w:tcPr>
           <w:p>
             <w:r>
-              <w:t>Android Gradle</w:t>
+              <w:rPr>
+                <w:sz w:val="17"/>
+              </w:rPr>
+              <w:t>SK-001 Scanner</w:t>
             </w:r>
           </w:p>
         </w:tc>
         <w:tc>
           <w:tcPr>
-            <w:tcW w:type="dxa" w:w="2880"/>
+            <w:tcW w:type="dxa" w:w="3168"/>
+            <w:tcMar>
+              <w:top w:w="60" w:type="dxa"/>
+              <w:bottom w:w="60" w:type="dxa"/>
+              <w:left w:w="80" w:type="dxa"/>
+              <w:right w:w="80" w:type="dxa"/>
+            </w:tcMar>
           </w:tcPr>
           <w:p>
             <w:r>
+              <w:rPr>
+                <w:sz w:val="17"/>
+              </w:rPr>
+              <w:t>node scripts/scan-personal-data.mjs</w:t>
+            </w:r>
+          </w:p>
+        </w:tc>
+        <w:tc>
+          <w:tcPr>
+            <w:tcW w:type="dxa" w:w="1440"/>
+            <w:tcMar>
+              <w:top w:w="60" w:type="dxa"/>
+              <w:bottom w:w="60" w:type="dxa"/>
+              <w:left w:w="80" w:type="dxa"/>
+              <w:right w:w="80" w:type="dxa"/>
+            </w:tcMar>
+          </w:tcPr>
+          <w:p>
+            <w:r>
+              <w:rPr>
+                <w:b/>
+                <w:color w:val="0A6644"/>
+                <w:sz w:val="17"/>
+              </w:rPr>
+              <w:t>3/3 PASS</w:t>
+            </w:r>
+          </w:p>
+        </w:tc>
+        <w:tc>
+          <w:tcPr>
+            <w:tcW w:type="dxa" w:w="3312"/>
+            <w:tcMar>
+              <w:top w:w="60" w:type="dxa"/>
+              <w:bottom w:w="60" w:type="dxa"/>
+              <w:left w:w="80" w:type="dxa"/>
+              <w:right w:w="80" w:type="dxa"/>
+            </w:tcMar>
+          </w:tcPr>
+          <w:p>
+            <w:r>
+              <w:rPr>
+                <w:sz w:val="17"/>
+              </w:rPr>
+              <w:t>Working tree bersih dari data personal</w:t>
+            </w:r>
+          </w:p>
+        </w:tc>
+      </w:tr>
+      <w:tr>
+        <w:tc>
+          <w:tcPr>
+            <w:tcW w:type="dxa" w:w="2160"/>
+            <w:tcMar>
+              <w:top w:w="60" w:type="dxa"/>
+              <w:bottom w:w="60" w:type="dxa"/>
+              <w:left w:w="80" w:type="dxa"/>
+              <w:right w:w="80" w:type="dxa"/>
+            </w:tcMar>
+          </w:tcPr>
+          <w:p>
+            <w:r>
+              <w:rPr>
+                <w:sz w:val="17"/>
+              </w:rPr>
+              <w:t>TypeScript</w:t>
+            </w:r>
+          </w:p>
+        </w:tc>
+        <w:tc>
+          <w:tcPr>
+            <w:tcW w:type="dxa" w:w="3168"/>
+            <w:tcMar>
+              <w:top w:w="60" w:type="dxa"/>
+              <w:bottom w:w="60" w:type="dxa"/>
+              <w:left w:w="80" w:type="dxa"/>
+              <w:right w:w="80" w:type="dxa"/>
+            </w:tcMar>
+          </w:tcPr>
+          <w:p>
+            <w:r>
+              <w:rPr>
+                <w:sz w:val="17"/>
+              </w:rPr>
+              <w:t>pnpm exec tsc --noEmit</w:t>
+            </w:r>
+          </w:p>
+        </w:tc>
+        <w:tc>
+          <w:tcPr>
+            <w:tcW w:type="dxa" w:w="1440"/>
+            <w:tcMar>
+              <w:top w:w="60" w:type="dxa"/>
+              <w:bottom w:w="60" w:type="dxa"/>
+              <w:left w:w="80" w:type="dxa"/>
+              <w:right w:w="80" w:type="dxa"/>
+            </w:tcMar>
+          </w:tcPr>
+          <w:p>
+            <w:r>
+              <w:rPr>
+                <w:b/>
+                <w:color w:val="0A6644"/>
+                <w:sz w:val="17"/>
+              </w:rPr>
+              <w:t>PASS</w:t>
+            </w:r>
+          </w:p>
+        </w:tc>
+        <w:tc>
+          <w:tcPr>
+            <w:tcW w:type="dxa" w:w="3312"/>
+            <w:tcMar>
+              <w:top w:w="60" w:type="dxa"/>
+              <w:bottom w:w="60" w:type="dxa"/>
+              <w:left w:w="80" w:type="dxa"/>
+              <w:right w:w="80" w:type="dxa"/>
+            </w:tcMar>
+          </w:tcPr>
+          <w:p>
+            <w:r>
+              <w:rPr>
+                <w:sz w:val="17"/>
+              </w:rPr>
+              <w:t>0 compilation error</w:t>
+            </w:r>
+          </w:p>
+        </w:tc>
+      </w:tr>
+      <w:tr>
+        <w:tc>
+          <w:tcPr>
+            <w:tcW w:type="dxa" w:w="2160"/>
+            <w:tcMar>
+              <w:top w:w="60" w:type="dxa"/>
+              <w:bottom w:w="60" w:type="dxa"/>
+              <w:left w:w="80" w:type="dxa"/>
+              <w:right w:w="80" w:type="dxa"/>
+            </w:tcMar>
+          </w:tcPr>
+          <w:p>
+            <w:r>
+              <w:rPr>
+                <w:sz w:val="17"/>
+              </w:rPr>
+              <w:t>Web Production</w:t>
+            </w:r>
+          </w:p>
+        </w:tc>
+        <w:tc>
+          <w:tcPr>
+            <w:tcW w:type="dxa" w:w="3168"/>
+            <w:tcMar>
+              <w:top w:w="60" w:type="dxa"/>
+              <w:bottom w:w="60" w:type="dxa"/>
+              <w:left w:w="80" w:type="dxa"/>
+              <w:right w:w="80" w:type="dxa"/>
+            </w:tcMar>
+          </w:tcPr>
+          <w:p>
+            <w:r>
+              <w:rPr>
+                <w:sz w:val="17"/>
+              </w:rPr>
+              <w:t>pnpm build</w:t>
+            </w:r>
+          </w:p>
+        </w:tc>
+        <w:tc>
+          <w:tcPr>
+            <w:tcW w:type="dxa" w:w="1440"/>
+            <w:tcMar>
+              <w:top w:w="60" w:type="dxa"/>
+              <w:bottom w:w="60" w:type="dxa"/>
+              <w:left w:w="80" w:type="dxa"/>
+              <w:right w:w="80" w:type="dxa"/>
+            </w:tcMar>
+          </w:tcPr>
+          <w:p>
+            <w:r>
+              <w:rPr>
+                <w:b/>
+                <w:color w:val="0A6644"/>
+                <w:sz w:val="17"/>
+              </w:rPr>
+              <w:t>PASS</w:t>
+            </w:r>
+          </w:p>
+        </w:tc>
+        <w:tc>
+          <w:tcPr>
+            <w:tcW w:type="dxa" w:w="3312"/>
+            <w:tcMar>
+              <w:top w:w="60" w:type="dxa"/>
+              <w:bottom w:w="60" w:type="dxa"/>
+              <w:left w:w="80" w:type="dxa"/>
+              <w:right w:w="80" w:type="dxa"/>
+            </w:tcMar>
+          </w:tcPr>
+          <w:p>
+            <w:r>
+              <w:rPr>
+                <w:sz w:val="17"/>
+              </w:rPr>
+              <w:t>Turbopack static generation berhasil</w:t>
+            </w:r>
+          </w:p>
+        </w:tc>
+      </w:tr>
+      <w:tr>
+        <w:tc>
+          <w:tcPr>
+            <w:tcW w:type="dxa" w:w="2160"/>
+            <w:tcMar>
+              <w:top w:w="60" w:type="dxa"/>
+              <w:bottom w:w="60" w:type="dxa"/>
+              <w:left w:w="80" w:type="dxa"/>
+              <w:right w:w="80" w:type="dxa"/>
+            </w:tcMar>
+          </w:tcPr>
+          <w:p>
+            <w:r>
+              <w:rPr>
+                <w:sz w:val="17"/>
+              </w:rPr>
+              <w:t>Mobile Export</w:t>
+            </w:r>
+          </w:p>
+        </w:tc>
+        <w:tc>
+          <w:tcPr>
+            <w:tcW w:type="dxa" w:w="3168"/>
+            <w:tcMar>
+              <w:top w:w="60" w:type="dxa"/>
+              <w:bottom w:w="60" w:type="dxa"/>
+              <w:left w:w="80" w:type="dxa"/>
+              <w:right w:w="80" w:type="dxa"/>
+            </w:tcMar>
+          </w:tcPr>
+          <w:p>
+            <w:r>
+              <w:rPr>
+                <w:sz w:val="17"/>
+              </w:rPr>
+              <w:t>pnpm build:mobile</w:t>
+            </w:r>
+          </w:p>
+        </w:tc>
+        <w:tc>
+          <w:tcPr>
+            <w:tcW w:type="dxa" w:w="1440"/>
+            <w:tcMar>
+              <w:top w:w="60" w:type="dxa"/>
+              <w:bottom w:w="60" w:type="dxa"/>
+              <w:left w:w="80" w:type="dxa"/>
+              <w:right w:w="80" w:type="dxa"/>
+            </w:tcMar>
+          </w:tcPr>
+          <w:p>
+            <w:r>
+              <w:rPr>
+                <w:b/>
+                <w:color w:val="0A6644"/>
+                <w:sz w:val="17"/>
+              </w:rPr>
+              <w:t>PASS</w:t>
+            </w:r>
+          </w:p>
+        </w:tc>
+        <w:tc>
+          <w:tcPr>
+            <w:tcW w:type="dxa" w:w="3312"/>
+            <w:tcMar>
+              <w:top w:w="60" w:type="dxa"/>
+              <w:bottom w:w="60" w:type="dxa"/>
+              <w:left w:w="80" w:type="dxa"/>
+              <w:right w:w="80" w:type="dxa"/>
+            </w:tcMar>
+          </w:tcPr>
+          <w:p>
+            <w:r>
+              <w:rPr>
+                <w:sz w:val="17"/>
+              </w:rPr>
+              <w:t>Export mode mobile berhasil di folder out/</w:t>
+            </w:r>
+          </w:p>
+        </w:tc>
+      </w:tr>
+      <w:tr>
+        <w:tc>
+          <w:tcPr>
+            <w:tcW w:type="dxa" w:w="2160"/>
+            <w:tcMar>
+              <w:top w:w="60" w:type="dxa"/>
+              <w:bottom w:w="60" w:type="dxa"/>
+              <w:left w:w="80" w:type="dxa"/>
+              <w:right w:w="80" w:type="dxa"/>
+            </w:tcMar>
+          </w:tcPr>
+          <w:p>
+            <w:r>
+              <w:rPr>
+                <w:sz w:val="17"/>
+              </w:rPr>
+              <w:t>Android Build</w:t>
+            </w:r>
+          </w:p>
+        </w:tc>
+        <w:tc>
+          <w:tcPr>
+            <w:tcW w:type="dxa" w:w="3168"/>
+            <w:tcMar>
+              <w:top w:w="60" w:type="dxa"/>
+              <w:bottom w:w="60" w:type="dxa"/>
+              <w:left w:w="80" w:type="dxa"/>
+              <w:right w:w="80" w:type="dxa"/>
+            </w:tcMar>
+          </w:tcPr>
+          <w:p>
+            <w:r>
+              <w:rPr>
+                <w:sz w:val="17"/>
+              </w:rPr>
+              <w:t>gradlew.bat --version</w:t>
+            </w:r>
+          </w:p>
+        </w:tc>
+        <w:tc>
+          <w:tcPr>
+            <w:tcW w:type="dxa" w:w="1440"/>
+            <w:tcMar>
+              <w:top w:w="60" w:type="dxa"/>
+              <w:bottom w:w="60" w:type="dxa"/>
+              <w:left w:w="80" w:type="dxa"/>
+              <w:right w:w="80" w:type="dxa"/>
+            </w:tcMar>
+          </w:tcPr>
+          <w:p>
+            <w:r>
+              <w:rPr>
+                <w:b/>
+                <w:color w:val="CC6600"/>
+                <w:sz w:val="17"/>
+              </w:rPr>
               <w:t>BLOCKED</w:t>
             </w:r>
           </w:p>
         </w:tc>
         <w:tc>
           <w:tcPr>
-            <w:tcW w:type="dxa" w:w="2880"/>
+            <w:tcW w:type="dxa" w:w="3312"/>
+            <w:tcMar>
+              <w:top w:w="60" w:type="dxa"/>
+              <w:bottom w:w="60" w:type="dxa"/>
+              <w:left w:w="80" w:type="dxa"/>
+              <w:right w:w="80" w:type="dxa"/>
+            </w:tcMar>
           </w:tcPr>
           <w:p>
             <w:r>
-              <w:t>JAVA_HOME belum dikonfigurasi di environment Windows</w:t>
+              <w:rPr>
+                <w:sz w:val="17"/>
+              </w:rPr>
+              <w:t>JAVA_HOME belum dikonfigurasi di environment</w:t>
+            </w:r>
+          </w:p>
+        </w:tc>
+      </w:tr>
+      <w:tr>
+        <w:tc>
+          <w:tcPr>
+            <w:tcW w:type="dxa" w:w="2160"/>
+            <w:tcMar>
+              <w:top w:w="60" w:type="dxa"/>
+              <w:bottom w:w="60" w:type="dxa"/>
+              <w:left w:w="80" w:type="dxa"/>
+              <w:right w:w="80" w:type="dxa"/>
+            </w:tcMar>
+          </w:tcPr>
+          <w:p>
+            <w:r>
+              <w:rPr>
+                <w:sz w:val="17"/>
+              </w:rPr>
+              <w:t>Git Whitespace</w:t>
+            </w:r>
+          </w:p>
+        </w:tc>
+        <w:tc>
+          <w:tcPr>
+            <w:tcW w:type="dxa" w:w="3168"/>
+            <w:tcMar>
+              <w:top w:w="60" w:type="dxa"/>
+              <w:bottom w:w="60" w:type="dxa"/>
+              <w:left w:w="80" w:type="dxa"/>
+              <w:right w:w="80" w:type="dxa"/>
+            </w:tcMar>
+          </w:tcPr>
+          <w:p>
+            <w:r>
+              <w:rPr>
+                <w:sz w:val="17"/>
+              </w:rPr>
+              <w:t>git diff --check</w:t>
+            </w:r>
+          </w:p>
+        </w:tc>
+        <w:tc>
+          <w:tcPr>
+            <w:tcW w:type="dxa" w:w="1440"/>
+            <w:tcMar>
+              <w:top w:w="60" w:type="dxa"/>
+              <w:bottom w:w="60" w:type="dxa"/>
+              <w:left w:w="80" w:type="dxa"/>
+              <w:right w:w="80" w:type="dxa"/>
+            </w:tcMar>
+          </w:tcPr>
+          <w:p>
+            <w:r>
+              <w:rPr>
+                <w:b/>
+                <w:color w:val="0A6644"/>
+                <w:sz w:val="17"/>
+              </w:rPr>
+              <w:t>PASS</w:t>
+            </w:r>
+          </w:p>
+        </w:tc>
+        <w:tc>
+          <w:tcPr>
+            <w:tcW w:type="dxa" w:w="3312"/>
+            <w:tcMar>
+              <w:top w:w="60" w:type="dxa"/>
+              <w:bottom w:w="60" w:type="dxa"/>
+              <w:left w:w="80" w:type="dxa"/>
+              <w:right w:w="80" w:type="dxa"/>
+            </w:tcMar>
+          </w:tcPr>
+          <w:p>
+            <w:r>
+              <w:rPr>
+                <w:sz w:val="17"/>
+              </w:rPr>
+              <w:t>Bersih dari merge/whitespace artifact</w:t>
+            </w:r>
+          </w:p>
+        </w:tc>
+      </w:tr>
+      <w:tr>
+        <w:tc>
+          <w:tcPr>
+            <w:tcW w:type="dxa" w:w="2160"/>
+            <w:tcMar>
+              <w:top w:w="60" w:type="dxa"/>
+              <w:bottom w:w="60" w:type="dxa"/>
+              <w:left w:w="80" w:type="dxa"/>
+              <w:right w:w="80" w:type="dxa"/>
+            </w:tcMar>
+          </w:tcPr>
+          <w:p>
+            <w:r>
+              <w:rPr>
+                <w:sz w:val="17"/>
+              </w:rPr>
+              <w:t>Working Tree</w:t>
+            </w:r>
+          </w:p>
+        </w:tc>
+        <w:tc>
+          <w:tcPr>
+            <w:tcW w:type="dxa" w:w="3168"/>
+            <w:tcMar>
+              <w:top w:w="60" w:type="dxa"/>
+              <w:bottom w:w="60" w:type="dxa"/>
+              <w:left w:w="80" w:type="dxa"/>
+              <w:right w:w="80" w:type="dxa"/>
+            </w:tcMar>
+          </w:tcPr>
+          <w:p>
+            <w:r>
+              <w:rPr>
+                <w:sz w:val="17"/>
+              </w:rPr>
+              <w:t>git status --short</w:t>
+            </w:r>
+          </w:p>
+        </w:tc>
+        <w:tc>
+          <w:tcPr>
+            <w:tcW w:type="dxa" w:w="1440"/>
+            <w:tcMar>
+              <w:top w:w="60" w:type="dxa"/>
+              <w:bottom w:w="60" w:type="dxa"/>
+              <w:left w:w="80" w:type="dxa"/>
+              <w:right w:w="80" w:type="dxa"/>
+            </w:tcMar>
+          </w:tcPr>
+          <w:p>
+            <w:r>
+              <w:rPr>
+                <w:b/>
+                <w:sz w:val="17"/>
+              </w:rPr>
+              <w:t>CLEAN</w:t>
+            </w:r>
+          </w:p>
+        </w:tc>
+        <w:tc>
+          <w:tcPr>
+            <w:tcW w:type="dxa" w:w="3312"/>
+            <w:tcMar>
+              <w:top w:w="60" w:type="dxa"/>
+              <w:bottom w:w="60" w:type="dxa"/>
+              <w:left w:w="80" w:type="dxa"/>
+              <w:right w:w="80" w:type="dxa"/>
+            </w:tcMar>
+          </w:tcPr>
+          <w:p>
+            <w:r>
+              <w:rPr>
+                <w:sz w:val="17"/>
+              </w:rPr>
+              <w:t>Seluruh perubahan telah ter-commit rapi</w:t>
             </w:r>
           </w:p>
         </w:tc>
@@ -435,22 +2658,86 @@
         <w:pStyle w:val="Heading1"/>
       </w:pPr>
       <w:r>
-        <w:t>3. Persetujuan yang Dibutuhkan dari Owner</w:t>
+        <w:rPr>
+          <w:color w:val="0F2A4A"/>
+        </w:rPr>
+        <w:t>4. Rekapitulasi Test Jujur</w:t>
       </w:r>
     </w:p>
     <w:p>
       <w:r>
-        <w:t>A. Persetujuan Normal Push 13 Commit ke origin/main: Menghapus data personal dari HEAD remote publik (Risiko: Rendah).</w:t>
+        <w:rPr>
+          <w:b/>
+        </w:rPr>
+        <w:t xml:space="preserve">• Total Functional Regression Tests: </w:t>
+      </w:r>
+      <w:r>
+        <w:t>34 tests (7 Budget + 18 Storage + 16 Restore = 41 sub-assertions dalam 34 skenario formal).</w:t>
+        <w:br/>
+      </w:r>
+      <w:r>
+        <w:rPr>
+          <w:b/>
+        </w:rPr>
+        <w:t xml:space="preserve">• Total Security Scanner Checks: </w:t>
+      </w:r>
+      <w:r>
+        <w:t>3 checks (kebersihan tracked assets, ukuran file, jumlah baris JSON).</w:t>
+        <w:br/>
+      </w:r>
+      <w:r>
+        <w:rPr>
+          <w:b/>
+        </w:rPr>
+        <w:t xml:space="preserve">• Kepatuhan: </w:t>
+      </w:r>
+      <w:r>
+        <w:t>Scanner checks dilaporkan terpisah dan tidak dicampuradukkan sebagai regression tests.</w:t>
+        <w:br/>
+      </w:r>
+    </w:p>
+    <w:p>
+      <w:pPr>
+        <w:pStyle w:val="Heading1"/>
+      </w:pPr>
+      <w:r>
+        <w:rPr>
+          <w:color w:val="0F2A4A"/>
+        </w:rPr>
+        <w:t>5. Tindakan yang Menunggu Persetujuan Owner</w:t>
       </w:r>
     </w:p>
     <w:p>
       <w:r>
-        <w:t>B. Persetujuan History Purge &amp; Force Push: Menghapus blob personal dari commit lama menggunakan git-filter-repo/BFG (Risiko: Tinggi).</w:t>
+        <w:rPr>
+          <w:b/>
+          <w:color w:val="0A6644"/>
+        </w:rPr>
+        <w:t>Persetujuan A — Normal Push 14 Commit ke origin/main (Risiko: Rendah)</w:t>
+      </w:r>
+    </w:p>
+    <w:p>
+      <w:r>
+        <w:t>Menjalankan fast-forward git push origin main untuk menghapus preloaded-state.json dari HEAD remote publik GitHub dan menyinkronkan perbaikan SK-001, SK-003, dan SK-004.</w:t>
+      </w:r>
+    </w:p>
+    <w:p>
+      <w:r>
+        <w:rPr>
+          <w:b/>
+          <w:color w:val="B91C1C"/>
+        </w:rPr>
+        <w:t>Persetujuan B — Git History Purge &amp; Force Push (Risiko: Sangat Tinggi)</w:t>
+      </w:r>
+    </w:p>
+    <w:p>
+      <w:r>
+        <w:t>Menjalankan git-filter-repo / BFG untuk menghapus permanen blob commit 97e04aa dari histori Git masa lalu, diikuti git push origin main --force.</w:t>
       </w:r>
     </w:p>
     <w:sectPr>
       <w:pgSz w:w="12240" w:h="15840"/>
-      <w:pgMar w:top="1440" w:right="1800" w:bottom="1440" w:left="1800" w:header="720" w:footer="720" w:gutter="0"/>
+      <w:pgMar w:top="1152" w:right="1152" w:bottom="1152" w:left="1152" w:header="720" w:footer="720" w:gutter="0"/>
       <w:cols w:space="720"/>
       <w:docGrid w:linePitch="360"/>
     </w:sectPr>
@@ -821,6 +3108,11 @@
     <w:name w:val="Normal"/>
     <w:qFormat/>
     <w:rsid w:val="00FC693F"/>
+    <w:rPr>
+      <w:rFonts w:ascii="Calibri" w:hAnsi="Calibri"/>
+      <w:color w:val="222222"/>
+      <w:sz w:val="21"/>
+    </w:rPr>
   </w:style>
   <w:style w:type="paragraph" w:styleId="Header">
     <w:name w:val="header"/>

</xml_diff>

<commit_message>
docs: sync Phase 0 report with current HEAD
</commit_message>
<xml_diff>
--- a/docs/LAPORAN_REMEDIASI_PHASE0_SAKUKILAT.docx
+++ b/docs/LAPORAN_REMEDIASI_PHASE0_SAKUKILAT.docx
@@ -152,7 +152,7 @@
               <w:rPr>
                 <w:sz w:val="19"/>
               </w:rPr>
-              <w:t>f689225 (14 commits ahead of origin/main)</w:t>
+              <w:t>20d340a (13 commits ahead of origin/main)</w:t>
             </w:r>
           </w:p>
         </w:tc>
@@ -267,7 +267,7 @@
         <w:rPr>
           <w:color w:val="0F2A4A"/>
         </w:rPr>
-        <w:t>1. Ringkasan Eksekusi &amp; Daftar 14 Commit</w:t>
+        <w:t>1. Ringkasan Eksekusi &amp; Daftar 13 Commit</w:t>
       </w:r>
     </w:p>
     <w:tbl>
@@ -1394,86 +1394,7 @@
               <w:rPr>
                 <w:sz w:val="17"/>
               </w:rPr>
-              <w:t>Sinkronisasi commit count &amp; HEAD hash ke dokumen laporan</w:t>
-            </w:r>
-          </w:p>
-        </w:tc>
-      </w:tr>
-      <w:tr>
-        <w:tc>
-          <w:tcPr>
-            <w:tcW w:type="dxa" w:w="576"/>
-            <w:tcMar>
-              <w:top w:w="60" w:type="dxa"/>
-              <w:bottom w:w="60" w:type="dxa"/>
-              <w:left w:w="80" w:type="dxa"/>
-              <w:right w:w="80" w:type="dxa"/>
-            </w:tcMar>
-          </w:tcPr>
-          <w:p>
-            <w:r>
-              <w:rPr>
-                <w:sz w:val="17"/>
-              </w:rPr>
-              <w:t>14</w:t>
-            </w:r>
-          </w:p>
-        </w:tc>
-        <w:tc>
-          <w:tcPr>
-            <w:tcW w:type="dxa" w:w="1584"/>
-            <w:tcMar>
-              <w:top w:w="60" w:type="dxa"/>
-              <w:bottom w:w="60" w:type="dxa"/>
-              <w:left w:w="80" w:type="dxa"/>
-              <w:right w:w="80" w:type="dxa"/>
-            </w:tcMar>
-          </w:tcPr>
-          <w:p>
-            <w:r>
-              <w:rPr>
-                <w:rFonts w:ascii="Consolas" w:hAnsi="Consolas"/>
-                <w:sz w:val="17"/>
-              </w:rPr>
-              <w:t>f689225</w:t>
-            </w:r>
-          </w:p>
-        </w:tc>
-        <w:tc>
-          <w:tcPr>
-            <w:tcW w:type="dxa" w:w="1440"/>
-            <w:tcMar>
-              <w:top w:w="60" w:type="dxa"/>
-              <w:bottom w:w="60" w:type="dxa"/>
-              <w:left w:w="80" w:type="dxa"/>
-              <w:right w:w="80" w:type="dxa"/>
-            </w:tcMar>
-          </w:tcPr>
-          <w:p>
-            <w:r>
-              <w:rPr>
-                <w:sz w:val="17"/>
-              </w:rPr>
-              <w:t>Docs</w:t>
-            </w:r>
-          </w:p>
-        </w:tc>
-        <w:tc>
-          <w:tcPr>
-            <w:tcW w:type="dxa" w:w="6480"/>
-            <w:tcMar>
-              <w:top w:w="60" w:type="dxa"/>
-              <w:bottom w:w="60" w:type="dxa"/>
-              <w:left w:w="80" w:type="dxa"/>
-              <w:right w:w="80" w:type="dxa"/>
-            </w:tcMar>
-          </w:tcPr>
-          <w:p>
-            <w:r>
-              <w:rPr>
-                <w:sz w:val="17"/>
-              </w:rPr>
-              <w:t>Finalisasi deliverable laporan Word (.docx) lengkap</w:t>
+              <w:t>docs: sync HEAD hash and commit counts in Phase 0 report</w:t>
             </w:r>
           </w:p>
         </w:tc>
@@ -2713,7 +2634,7 @@
           <w:b/>
           <w:color w:val="0A6644"/>
         </w:rPr>
-        <w:t>Persetujuan A — Normal Push 14 Commit ke origin/main (Risiko: Rendah)</w:t>
+        <w:t>Persetujuan A — Normal Push 13 Commit ke origin/main (Risiko: Rendah)</w:t>
       </w:r>
     </w:p>
     <w:p>

</xml_diff>

<commit_message>
docs: update Phase 0 report and DOCX to reflect post-push status
</commit_message>
<xml_diff>
--- a/docs/LAPORAN_REMEDIASI_PHASE0_SAKUKILAT.docx
+++ b/docs/LAPORAN_REMEDIASI_PHASE0_SAKUKILAT.docx
@@ -132,7 +132,7 @@
                 <w:b/>
                 <w:sz w:val="19"/>
               </w:rPr>
-              <w:t>Current Local HEAD</w:t>
+              <w:t>Current Local HEAD &amp; origin/main</w:t>
             </w:r>
           </w:p>
         </w:tc>
@@ -152,7 +152,7 @@
               <w:rPr>
                 <w:sz w:val="19"/>
               </w:rPr>
-              <w:t>20d340a (13 commits ahead of origin/main)</w:t>
+              <w:t>81255a4 (Sinkron penuh, 0 ahead, 0 behind)</w:t>
             </w:r>
           </w:p>
         </w:tc>
@@ -240,7 +240,7 @@
                 <w:color w:val="0A6644"/>
                 <w:sz w:val="19"/>
               </w:rPr>
-              <w:t>LOCAL REMEDIATION COMPLETE — REMOTE HEAD &amp; HISTORY PURGE PENDING OWNER APPROVAL</w:t>
+              <w:t>LOCAL &amp; REMOTE HEAD CONTAINMENT COMPLETE — HISTORY PURGE PENDING OWNER APPROVAL</w:t>
             </w:r>
           </w:p>
         </w:tc>
@@ -256,7 +256,7 @@
         </w:rPr>
         <w:t>Catatan Kepatuhan &amp; Transparansi:</w:t>
         <w:br/>
-        <w:t>Laporan ini mengoreksi secara jujur klaim awal 'Phase 0 Complete'. Perlindungan kode lokal, validasi integritas data, dan regression test langsung terhadap kode produksi telah selesai 100%. Tidak ada data personal pada working tree lokal, mutasi saat storage rusak telah diblokir, restore transaksional multi-key telah aktif, dan 34 regression tests lulus. Tindakan remote push dan history purge membutuhkan persetujuan eksplisit owner sesuai DEV-PROTOCOL.</w:t>
+        <w:t>Laporan ini mengoreksi secara jujur klaim awal 'Phase 0 Complete'. Perlindungan kode lokal, validasi integritas data, dan regression test langsung terhadap kode produksi telah selesai 100%. File data personal telah resmi terhapus dari HEAD remote origin/main pasca-normal push (commit 81255a4). Tindakan remote push telah selesai dan terverifikasi sinkron penuh, sementara history purge tetap membutuhkan persetujuan eksplisit owner sesuai DEV-PROTOCOL.</w:t>
       </w:r>
     </w:p>
     <w:p>
@@ -267,7 +267,7 @@
         <w:rPr>
           <w:color w:val="0F2A4A"/>
         </w:rPr>
-        <w:t>1. Ringkasan Eksekusi &amp; Daftar 13 Commit</w:t>
+        <w:t>1. Ringkasan Eksekusi &amp; Daftar 16 Commit</w:t>
       </w:r>
     </w:p>
     <w:tbl>
@@ -1394,7 +1394,244 @@
               <w:rPr>
                 <w:sz w:val="17"/>
               </w:rPr>
-              <w:t>docs: sync HEAD hash and commit counts in Phase 0 report</w:t>
+              <w:t>Sinkronisasi commit count &amp; HEAD hash ke dokumen laporan</w:t>
+            </w:r>
+          </w:p>
+        </w:tc>
+      </w:tr>
+      <w:tr>
+        <w:tc>
+          <w:tcPr>
+            <w:tcW w:type="dxa" w:w="576"/>
+            <w:tcMar>
+              <w:top w:w="60" w:type="dxa"/>
+              <w:bottom w:w="60" w:type="dxa"/>
+              <w:left w:w="80" w:type="dxa"/>
+              <w:right w:w="80" w:type="dxa"/>
+            </w:tcMar>
+          </w:tcPr>
+          <w:p>
+            <w:r>
+              <w:rPr>
+                <w:sz w:val="17"/>
+              </w:rPr>
+              <w:t>14</w:t>
+            </w:r>
+          </w:p>
+        </w:tc>
+        <w:tc>
+          <w:tcPr>
+            <w:tcW w:type="dxa" w:w="1584"/>
+            <w:tcMar>
+              <w:top w:w="60" w:type="dxa"/>
+              <w:bottom w:w="60" w:type="dxa"/>
+              <w:left w:w="80" w:type="dxa"/>
+              <w:right w:w="80" w:type="dxa"/>
+            </w:tcMar>
+          </w:tcPr>
+          <w:p>
+            <w:r>
+              <w:rPr>
+                <w:rFonts w:ascii="Consolas" w:hAnsi="Consolas"/>
+                <w:sz w:val="17"/>
+              </w:rPr>
+              <w:t>f689225</w:t>
+            </w:r>
+          </w:p>
+        </w:tc>
+        <w:tc>
+          <w:tcPr>
+            <w:tcW w:type="dxa" w:w="1440"/>
+            <w:tcMar>
+              <w:top w:w="60" w:type="dxa"/>
+              <w:bottom w:w="60" w:type="dxa"/>
+              <w:left w:w="80" w:type="dxa"/>
+              <w:right w:w="80" w:type="dxa"/>
+            </w:tcMar>
+          </w:tcPr>
+          <w:p>
+            <w:r>
+              <w:rPr>
+                <w:sz w:val="17"/>
+              </w:rPr>
+              <w:t>Docs</w:t>
+            </w:r>
+          </w:p>
+        </w:tc>
+        <w:tc>
+          <w:tcPr>
+            <w:tcW w:type="dxa" w:w="6480"/>
+            <w:tcMar>
+              <w:top w:w="60" w:type="dxa"/>
+              <w:bottom w:w="60" w:type="dxa"/>
+              <w:left w:w="80" w:type="dxa"/>
+              <w:right w:w="80" w:type="dxa"/>
+            </w:tcMar>
+          </w:tcPr>
+          <w:p>
+            <w:r>
+              <w:rPr>
+                <w:sz w:val="17"/>
+              </w:rPr>
+              <w:t>Finalisasi deliverable laporan Word (.docx) lengkap</w:t>
+            </w:r>
+          </w:p>
+        </w:tc>
+      </w:tr>
+      <w:tr>
+        <w:tc>
+          <w:tcPr>
+            <w:tcW w:type="dxa" w:w="576"/>
+            <w:tcMar>
+              <w:top w:w="60" w:type="dxa"/>
+              <w:bottom w:w="60" w:type="dxa"/>
+              <w:left w:w="80" w:type="dxa"/>
+              <w:right w:w="80" w:type="dxa"/>
+            </w:tcMar>
+          </w:tcPr>
+          <w:p>
+            <w:r>
+              <w:rPr>
+                <w:sz w:val="17"/>
+              </w:rPr>
+              <w:t>15</w:t>
+            </w:r>
+          </w:p>
+        </w:tc>
+        <w:tc>
+          <w:tcPr>
+            <w:tcW w:type="dxa" w:w="1584"/>
+            <w:tcMar>
+              <w:top w:w="60" w:type="dxa"/>
+              <w:bottom w:w="60" w:type="dxa"/>
+              <w:left w:w="80" w:type="dxa"/>
+              <w:right w:w="80" w:type="dxa"/>
+            </w:tcMar>
+          </w:tcPr>
+          <w:p>
+            <w:r>
+              <w:rPr>
+                <w:rFonts w:ascii="Consolas" w:hAnsi="Consolas"/>
+                <w:sz w:val="17"/>
+              </w:rPr>
+              <w:t>920be07</w:t>
+            </w:r>
+          </w:p>
+        </w:tc>
+        <w:tc>
+          <w:tcPr>
+            <w:tcW w:type="dxa" w:w="1440"/>
+            <w:tcMar>
+              <w:top w:w="60" w:type="dxa"/>
+              <w:bottom w:w="60" w:type="dxa"/>
+              <w:left w:w="80" w:type="dxa"/>
+              <w:right w:w="80" w:type="dxa"/>
+            </w:tcMar>
+          </w:tcPr>
+          <w:p>
+            <w:r>
+              <w:rPr>
+                <w:sz w:val="17"/>
+              </w:rPr>
+              <w:t>Docs</w:t>
+            </w:r>
+          </w:p>
+        </w:tc>
+        <w:tc>
+          <w:tcPr>
+            <w:tcW w:type="dxa" w:w="6480"/>
+            <w:tcMar>
+              <w:top w:w="60" w:type="dxa"/>
+              <w:bottom w:w="60" w:type="dxa"/>
+              <w:left w:w="80" w:type="dxa"/>
+              <w:right w:w="80" w:type="dxa"/>
+            </w:tcMar>
+          </w:tcPr>
+          <w:p>
+            <w:r>
+              <w:rPr>
+                <w:sz w:val="17"/>
+              </w:rPr>
+              <w:t>Finalisasi laporan Phase 0 dalam format DOCX, HTML, dan Markdown</w:t>
+            </w:r>
+          </w:p>
+        </w:tc>
+      </w:tr>
+      <w:tr>
+        <w:tc>
+          <w:tcPr>
+            <w:tcW w:type="dxa" w:w="576"/>
+            <w:tcMar>
+              <w:top w:w="60" w:type="dxa"/>
+              <w:bottom w:w="60" w:type="dxa"/>
+              <w:left w:w="80" w:type="dxa"/>
+              <w:right w:w="80" w:type="dxa"/>
+            </w:tcMar>
+          </w:tcPr>
+          <w:p>
+            <w:r>
+              <w:rPr>
+                <w:sz w:val="17"/>
+              </w:rPr>
+              <w:t>16</w:t>
+            </w:r>
+          </w:p>
+        </w:tc>
+        <w:tc>
+          <w:tcPr>
+            <w:tcW w:type="dxa" w:w="1584"/>
+            <w:tcMar>
+              <w:top w:w="60" w:type="dxa"/>
+              <w:bottom w:w="60" w:type="dxa"/>
+              <w:left w:w="80" w:type="dxa"/>
+              <w:right w:w="80" w:type="dxa"/>
+            </w:tcMar>
+          </w:tcPr>
+          <w:p>
+            <w:r>
+              <w:rPr>
+                <w:rFonts w:ascii="Consolas" w:hAnsi="Consolas"/>
+                <w:sz w:val="17"/>
+              </w:rPr>
+              <w:t>81255a4</w:t>
+            </w:r>
+          </w:p>
+        </w:tc>
+        <w:tc>
+          <w:tcPr>
+            <w:tcW w:type="dxa" w:w="1440"/>
+            <w:tcMar>
+              <w:top w:w="60" w:type="dxa"/>
+              <w:bottom w:w="60" w:type="dxa"/>
+              <w:left w:w="80" w:type="dxa"/>
+              <w:right w:w="80" w:type="dxa"/>
+            </w:tcMar>
+          </w:tcPr>
+          <w:p>
+            <w:r>
+              <w:rPr>
+                <w:sz w:val="17"/>
+              </w:rPr>
+              <w:t>Docs</w:t>
+            </w:r>
+          </w:p>
+        </w:tc>
+        <w:tc>
+          <w:tcPr>
+            <w:tcW w:type="dxa" w:w="6480"/>
+            <w:tcMar>
+              <w:top w:w="60" w:type="dxa"/>
+              <w:bottom w:w="60" w:type="dxa"/>
+              <w:left w:w="80" w:type="dxa"/>
+              <w:right w:w="80" w:type="dxa"/>
+            </w:tcMar>
+          </w:tcPr>
+          <w:p>
+            <w:r>
+              <w:rPr>
+                <w:sz w:val="17"/>
+              </w:rPr>
+              <w:t>Sinkronisasi laporan Phase 0 sebelum normal push ke remote</w:t>
             </w:r>
           </w:p>
         </w:tc>
@@ -1427,7 +1664,7 @@
         <w:t xml:space="preserve">Status: </w:t>
       </w:r>
       <w:r>
-        <w:t>Local HEAD Containment Selesai. Remote HEAD &amp; History Purge Menunggu Persetujuan Owner.</w:t>
+        <w:t>Local &amp; Remote HEAD Containment Selesai. History Purge Tetap Menunggu Persetujuan Owner.</w:t>
         <w:br/>
       </w:r>
       <w:r>
@@ -1438,6 +1675,16 @@
       </w:r>
       <w:r>
         <w:t>File preloaded-state.json (424KB, 1.437 transaksi) telah dihapus dari repositori lokal sejak commit b8bf646. Aturan .gitignore telah ditambahkan.</w:t>
+        <w:br/>
+      </w:r>
+      <w:r>
+        <w:rPr>
+          <w:b/>
+        </w:rPr>
+        <w:t xml:space="preserve">• Remote HEAD Containment: </w:t>
+      </w:r>
+      <w:r>
+        <w:t>Selesai. Normal push fast-forward telah berhasil dieksekusi ke origin/main (7707ab8..81255a4). File personal preloaded-state.json telah resmi hilang dari HEAD remote publik GitHub.</w:t>
         <w:br/>
       </w:r>
       <w:r>
@@ -1458,6 +1705,16 @@
       </w:r>
       <w:r>
         <w:t>Scanner memverifikasi kebersihan working tree dan tracked files lokal. Scanner bukan history scanner dan bukan PII scanner universal.</w:t>
+        <w:br/>
+      </w:r>
+      <w:r>
+        <w:rPr>
+          <w:b/>
+        </w:rPr>
+        <w:t xml:space="preserve">• History Purge: </w:t>
+      </w:r>
+      <w:r>
+        <w:t>Tetap menunggu persetujuan owner untuk rewrite history commit 97e04aa.</w:t>
         <w:br/>
       </w:r>
     </w:p>
@@ -2625,7 +2882,7 @@
         <w:rPr>
           <w:color w:val="0F2A4A"/>
         </w:rPr>
-        <w:t>5. Tindakan yang Menunggu Persetujuan Owner</w:t>
+        <w:t>5. Status Persetujuan &amp; Tindakan</w:t>
       </w:r>
     </w:p>
     <w:p>
@@ -2634,12 +2891,12 @@
           <w:b/>
           <w:color w:val="0A6644"/>
         </w:rPr>
-        <w:t>Persetujuan A — Normal Push 13 Commit ke origin/main (Risiko: Rendah)</w:t>
+        <w:t>Persetujuan A — Normal Push ke origin/main (SELESAI)</w:t>
       </w:r>
     </w:p>
     <w:p>
       <w:r>
-        <w:t>Menjalankan fast-forward git push origin main untuk menghapus preloaded-state.json dari HEAD remote publik GitHub dan menyinkronkan perbaikan SK-001, SK-003, dan SK-004.</w:t>
+        <w:t>Telah berhasil dieksekusi via normal push (7707ab8..81255a4). File personal preloaded-state.json telah resmi hilang dari HEAD remote origin/main di GitHub. Local dan remote telah sinkron penuh.</w:t>
       </w:r>
     </w:p>
     <w:p>
@@ -2648,12 +2905,12 @@
           <w:b/>
           <w:color w:val="B91C1C"/>
         </w:rPr>
-        <w:t>Persetujuan B — Git History Purge &amp; Force Push (Risiko: Sangat Tinggi)</w:t>
+        <w:t>Persetujuan B — Git History Purge &amp; Force Push (TETAP PENDING OWNER APPROVAL)</w:t>
       </w:r>
     </w:p>
     <w:p>
       <w:r>
-        <w:t>Menjalankan git-filter-repo / BFG untuk menghapus permanen blob commit 97e04aa dari histori Git masa lalu, diikuti git push origin main --force.</w:t>
+        <w:t>Menjalankan git-filter-repo / BFG untuk menghapus permanen blob commit 97e04aa dari histori Git masa lalu, diikuti git push origin main --force. Tindakan ini tetap menunggu izin eksplisit owner.</w:t>
       </w:r>
     </w:p>
     <w:sectPr>

</xml_diff>